<commit_message>
Kalender: SEBIA in drie groepen overdag, SEBIA 5 van 15 tot 26 maart in het rooster, SEBIA 6 sep-dec 2027
Co-Authored-By: Claude Opus 5.5 <noreply@anthropic.com>
</commit_message>
<xml_diff>
--- a/Educatie/PARADISE_kalender_opleiding.docx
+++ b/Educatie/PARADISE_kalender_opleiding.docx
@@ -5056,6 +5056,7 @@
         <w:tc>
           <w:tcPr>
             <w:tcW w:type="dxa" w:w="2835"/>
+            <w:shd w:val="clear" w:color="auto" w:fill="FFE9D6"/>
           </w:tcPr>
           <w:p>
             <w:pPr>
@@ -5072,10 +5073,26 @@
               <w:t>15</w:t>
             </w:r>
           </w:p>
+          <w:p>
+            <w:pPr>
+              <w:spacing w:before="20" w:after="20"/>
+            </w:pPr>
+            <w:r>
+              <w:rPr>
+                <w:rFonts w:ascii="Segoe UI" w:hAnsi="Segoe UI"/>
+                <w:b/>
+                <w:i w:val="0"/>
+                <w:color w:val="A34A00"/>
+                <w:sz w:val="15"/>
+              </w:rPr>
+              <w:t>SEBIA 5, 15 tot 26 mrt: 1,5 u per podoloog in het eigen centrum, met Dobbels, naar voorkeur van de podoloog</w:t>
+            </w:r>
+          </w:p>
         </w:tc>
         <w:tc>
           <w:tcPr>
             <w:tcW w:type="dxa" w:w="2835"/>
+            <w:shd w:val="clear" w:color="auto" w:fill="FFE9D6"/>
           </w:tcPr>
           <w:p>
             <w:pPr>
@@ -5096,6 +5113,7 @@
         <w:tc>
           <w:tcPr>
             <w:tcW w:type="dxa" w:w="2835"/>
+            <w:shd w:val="clear" w:color="auto" w:fill="FFE9D6"/>
           </w:tcPr>
           <w:p>
             <w:pPr>
@@ -5116,6 +5134,7 @@
         <w:tc>
           <w:tcPr>
             <w:tcW w:type="dxa" w:w="2835"/>
+            <w:shd w:val="clear" w:color="auto" w:fill="FFE9D6"/>
           </w:tcPr>
           <w:p>
             <w:pPr>
@@ -5136,6 +5155,7 @@
         <w:tc>
           <w:tcPr>
             <w:tcW w:type="dxa" w:w="2835"/>
+            <w:shd w:val="clear" w:color="auto" w:fill="FFE9D6"/>
           </w:tcPr>
           <w:p>
             <w:pPr>
@@ -5181,6 +5201,7 @@
         <w:tc>
           <w:tcPr>
             <w:tcW w:type="dxa" w:w="2835"/>
+            <w:shd w:val="clear" w:color="auto" w:fill="FFE9D6"/>
           </w:tcPr>
           <w:p>
             <w:pPr>
@@ -5201,6 +5222,7 @@
         <w:tc>
           <w:tcPr>
             <w:tcW w:type="dxa" w:w="2835"/>
+            <w:shd w:val="clear" w:color="auto" w:fill="FFE9D6"/>
           </w:tcPr>
           <w:p>
             <w:pPr>
@@ -5221,6 +5243,7 @@
         <w:tc>
           <w:tcPr>
             <w:tcW w:type="dxa" w:w="2835"/>
+            <w:shd w:val="clear" w:color="auto" w:fill="FFE9D6"/>
           </w:tcPr>
           <w:p>
             <w:pPr>
@@ -5241,6 +5264,7 @@
         <w:tc>
           <w:tcPr>
             <w:tcW w:type="dxa" w:w="2835"/>
+            <w:shd w:val="clear" w:color="auto" w:fill="FFE9D6"/>
           </w:tcPr>
           <w:p>
             <w:pPr>
@@ -5261,6 +5285,7 @@
         <w:tc>
           <w:tcPr>
             <w:tcW w:type="dxa" w:w="2835"/>
+            <w:shd w:val="clear" w:color="auto" w:fill="FFE9D6"/>
           </w:tcPr>
           <w:p>
             <w:pPr>
@@ -5465,7 +5490,7 @@
           <w:color w:val="1B2630"/>
           <w:sz w:val="17"/>
         </w:rPr>
-        <w:t>SEBIA 5, 1,5 u per podoloog in het eigen centrum, door Dobbels, in maart vóór de paasvakantie (A) of vanaf 12 april (B), bij voorkeur vóór de eerste maand 3-visite (beste moment: Kortrijk wo, Brugge ma VM, Antwerpen di of wo VM, Aalst di; Gent en Leuven nog op te vragen). SEBIA 6, intervisie met feedback, 1 u per podoloog, online, door Dobbels, op maand 6–9 na de start van de inclusies.</w:t>
+        <w:t>SEBIA 5, 1,5 u per podoloog in het eigen centrum, door Dobbels, van 15 tot 26 maart, na SEBIA 3 en 4 (A) of vanaf 12 april (B), bij voorkeur vóór de eerste maand 3-visite (beste moment: Kortrijk wo, Brugge ma VM, Antwerpen di of wo VM, Aalst di; Gent en Leuven nog op te vragen). SEBIA 6, intervisie met feedback, 1 u per podoloog, online, door Dobbels, op maand 6–9 na de start, september tot december 2027 bij een start begin maart.</w:t>
       </w:r>
     </w:p>
     <w:p>
@@ -5511,7 +5536,7 @@
           <w:color w:val="5A6A78"/>
           <w:sz w:val="17"/>
         </w:rPr>
-        <w:t>Technologie en droogloop ter plaatse; SEBIA 1–4 centraal. De online sessies staan in de maandrasters. De technologie begint met theorie, waar de artsen kunnen aansluiten en de twee pedorthisten elk één keer komen, bij een van hun centra.</w:t>
+        <w:t>Technologie en droogloop ter plaatse; SEBIA 1–4 in drie groepen, voor Gent in UZ Gent; SEBIA 5 in het eigen centrum. De online sessies staan in de maandrasters. De technologie begint met theorie, waar de artsen kunnen aansluiten en de twee pedorthisten elk één keer komen, bij een van hun centra.</w:t>
       </w:r>
     </w:p>
     <w:tbl>

</xml_diff>

<commit_message>
Opleidingsplanning en kalender bijgewerkt tot 8 oktober: SEBIA 3-5 op de data van Dobbels, MoveMonitor alleen bij de start, tot drie aanpassingen
SEBIA 3 en 4 op 1, 2 en 5 maart met inhaal 8 maart; SEBIA 5 per centrum tussen 20 en 30 april; kalender loopt tot april.
Planning: fiche per centrum in plaats van het toetsingsblad, meeting 12 oktober, en nieuwe beslispunten na een volledige
datacontrole (geen inhaal voor SEBIA 1-2, inhaal SEBIA 3-4 op maandag past alleen Kortrijk). Fiche Brugge: maandagnamiddag
voor SEBIA 3-4 expliciet.

Co-Authored-By: Claude Opus 5.5 <noreply@anthropic.com>
</commit_message>
<xml_diff>
--- a/Educatie/PARADISE_kalender_opleiding.docx
+++ b/Educatie/PARADISE_kalender_opleiding.docx
@@ -44,7 +44,7 @@
           <w:color w:val="5A6A78"/>
           <w:sz w:val="17"/>
         </w:rPr>
-        <w:t>November 2026 tot maart 2027, volgens de opleidingsplanning van 29 september 2026. VM = voormiddag, NM = namiddag. Waar het niet voor iedereen lukt, staat in het rooster optie A, het voorstel; optie B staat onder de maand. Beide worden getoetst bij de centra tegen vr 16 okt. Artsen volgen alleen theorie en kunnen aansluiten bij het theoriedeel van de technologie; de praktijk en de droogloop zijn voor de podologen.</w:t>
+        <w:t>November 2026 tot april 2027, volgens de opleidingsplanning van 8 oktober 2026. VM = voormiddag, NM = namiddag. Waar het niet voor iedereen lukt, staat in het rooster optie A, het voorstel; optie B staat onder de maand. Beide worden getoetst bij de centra tegen vr 16 okt. Artsen volgen alleen theorie en kunnen aansluiten bij het theoriedeel van de technologie; de praktijk en de droogloop zijn voor de podologen.</w:t>
       </w:r>
     </w:p>
     <w:tbl>
@@ -4698,6 +4698,7 @@
         <w:tc>
           <w:tcPr>
             <w:tcW w:type="dxa" w:w="2835"/>
+            <w:shd w:val="clear" w:color="auto" w:fill="FFE9D6"/>
           </w:tcPr>
           <w:p>
             <w:pPr>
@@ -4712,6 +4713,97 @@
                 <w:sz w:val="15"/>
               </w:rPr>
               <w:t>1</w:t>
+            </w:r>
+          </w:p>
+          <w:p>
+            <w:pPr>
+              <w:spacing w:before="20" w:after="20"/>
+            </w:pPr>
+            <w:r>
+              <w:rPr>
+                <w:rFonts w:ascii="Segoe UI" w:hAnsi="Segoe UI"/>
+                <w:b/>
+                <w:i w:val="0"/>
+                <w:color w:val="A34A00"/>
+                <w:sz w:val="15"/>
+              </w:rPr>
+              <w:t xml:space="preserve">NM  </w:t>
+            </w:r>
+            <w:r>
+              <w:rPr>
+                <w:rFonts w:ascii="Segoe UI" w:hAnsi="Segoe UI"/>
+                <w:b/>
+                <w:i w:val="0"/>
+                <w:color w:val="A34A00"/>
+                <w:sz w:val="15"/>
+              </w:rPr>
+              <w:t>SEBIA 3–4, Kortrijk en Brugge (1e podoloog)</w:t>
+            </w:r>
+            <w:r>
+              <w:rPr>
+                <w:rFonts w:ascii="Segoe UI" w:hAnsi="Segoe UI"/>
+                <w:b w:val="0"/>
+                <w:i w:val="0"/>
+                <w:color w:val="1B2630"/>
+                <w:sz w:val="15"/>
+              </w:rPr>
+              <w:t xml:space="preserve"> · plaats volgt</w:t>
+            </w:r>
+          </w:p>
+        </w:tc>
+        <w:tc>
+          <w:tcPr>
+            <w:tcW w:type="dxa" w:w="2835"/>
+            <w:shd w:val="clear" w:color="auto" w:fill="FFE9D6"/>
+          </w:tcPr>
+          <w:p>
+            <w:pPr>
+              <w:spacing w:before="20" w:after="20"/>
+            </w:pPr>
+            <w:r>
+              <w:rPr>
+                <w:rFonts w:ascii="Segoe UI" w:hAnsi="Segoe UI"/>
+                <w:b/>
+                <w:i w:val="0"/>
+                <w:color w:val="5A6A78"/>
+                <w:sz w:val="15"/>
+              </w:rPr>
+              <w:t>2</w:t>
+            </w:r>
+          </w:p>
+          <w:p>
+            <w:pPr>
+              <w:spacing w:before="20" w:after="20"/>
+            </w:pPr>
+            <w:r>
+              <w:rPr>
+                <w:rFonts w:ascii="Segoe UI" w:hAnsi="Segoe UI"/>
+                <w:b/>
+                <w:i w:val="0"/>
+                <w:color w:val="A34A00"/>
+                <w:sz w:val="15"/>
+              </w:rPr>
+              <w:t xml:space="preserve">NM  </w:t>
+            </w:r>
+            <w:r>
+              <w:rPr>
+                <w:rFonts w:ascii="Segoe UI" w:hAnsi="Segoe UI"/>
+                <w:b/>
+                <w:i w:val="0"/>
+                <w:color w:val="A34A00"/>
+                <w:sz w:val="15"/>
+              </w:rPr>
+              <w:t>SEBIA 3–4, groep Oost en Brugge (2e podoloog)</w:t>
+            </w:r>
+            <w:r>
+              <w:rPr>
+                <w:rFonts w:ascii="Segoe UI" w:hAnsi="Segoe UI"/>
+                <w:b w:val="0"/>
+                <w:i w:val="0"/>
+                <w:color w:val="1B2630"/>
+                <w:sz w:val="15"/>
+              </w:rPr>
+              <w:t xml:space="preserve"> · centraal, voorstel Leuven</w:t>
             </w:r>
           </w:p>
         </w:tc>
@@ -4731,7 +4823,7 @@
                 <w:color w:val="5A6A78"/>
                 <w:sz w:val="15"/>
               </w:rPr>
-              <w:t>2</w:t>
+              <w:t>3</w:t>
             </w:r>
           </w:p>
         </w:tc>
@@ -4751,13 +4843,14 @@
                 <w:color w:val="5A6A78"/>
                 <w:sz w:val="15"/>
               </w:rPr>
-              <w:t>3</w:t>
+              <w:t>4</w:t>
             </w:r>
           </w:p>
         </w:tc>
         <w:tc>
           <w:tcPr>
             <w:tcW w:type="dxa" w:w="2835"/>
+            <w:shd w:val="clear" w:color="auto" w:fill="FFE9D6"/>
           </w:tcPr>
           <w:p>
             <w:pPr>
@@ -4771,14 +4864,9 @@
                 <w:color w:val="5A6A78"/>
                 <w:sz w:val="15"/>
               </w:rPr>
-              <w:t>4</w:t>
+              <w:t>5</w:t>
             </w:r>
           </w:p>
-        </w:tc>
-        <w:tc>
-          <w:tcPr>
-            <w:tcW w:type="dxa" w:w="2835"/>
-          </w:tcPr>
           <w:p>
             <w:pPr>
               <w:spacing w:before="20" w:after="20"/>
@@ -4788,10 +4876,30 @@
                 <w:rFonts w:ascii="Segoe UI" w:hAnsi="Segoe UI"/>
                 <w:b/>
                 <w:i w:val="0"/>
-                <w:color w:val="5A6A78"/>
-                <w:sz w:val="15"/>
-              </w:rPr>
-              <w:t>5</w:t>
+                <w:color w:val="A34A00"/>
+                <w:sz w:val="15"/>
+              </w:rPr>
+              <w:t xml:space="preserve">NM  </w:t>
+            </w:r>
+            <w:r>
+              <w:rPr>
+                <w:rFonts w:ascii="Segoe UI" w:hAnsi="Segoe UI"/>
+                <w:b/>
+                <w:i w:val="0"/>
+                <w:color w:val="A34A00"/>
+                <w:sz w:val="15"/>
+              </w:rPr>
+              <w:t>SEBIA 3–4, Gent</w:t>
+            </w:r>
+            <w:r>
+              <w:rPr>
+                <w:rFonts w:ascii="Segoe UI" w:hAnsi="Segoe UI"/>
+                <w:b w:val="0"/>
+                <w:i w:val="0"/>
+                <w:color w:val="1B2630"/>
+                <w:sz w:val="15"/>
+              </w:rPr>
+              <w:t xml:space="preserve"> · UZ Gent</w:t>
             </w:r>
           </w:p>
         </w:tc>
@@ -4823,6 +4931,7 @@
         <w:tc>
           <w:tcPr>
             <w:tcW w:type="dxa" w:w="2835"/>
+            <w:shd w:val="clear" w:color="auto" w:fill="FFFFFF"/>
           </w:tcPr>
           <w:p>
             <w:pPr>
@@ -4839,12 +4948,6 @@
               <w:t>8</w:t>
             </w:r>
           </w:p>
-        </w:tc>
-        <w:tc>
-          <w:tcPr>
-            <w:tcW w:type="dxa" w:w="2835"/>
-            <w:shd w:val="clear" w:color="auto" w:fill="FFE9D6"/>
-          </w:tcPr>
           <w:p>
             <w:pPr>
               <w:spacing w:before="20" w:after="20"/>
@@ -4853,102 +4956,21 @@
               <w:rPr>
                 <w:rFonts w:ascii="Segoe UI" w:hAnsi="Segoe UI"/>
                 <w:b/>
-                <w:i w:val="0"/>
+                <w:i/>
                 <w:color w:val="5A6A78"/>
                 <w:sz w:val="15"/>
               </w:rPr>
-              <w:t>9</w:t>
-            </w:r>
-          </w:p>
-          <w:p>
-            <w:pPr>
-              <w:spacing w:before="20" w:after="20"/>
-            </w:pPr>
-            <w:r>
-              <w:rPr>
-                <w:rFonts w:ascii="Segoe UI" w:hAnsi="Segoe UI"/>
-                <w:b/>
-                <w:i w:val="0"/>
-                <w:color w:val="A34A00"/>
-                <w:sz w:val="15"/>
-              </w:rPr>
-              <w:t xml:space="preserve">13u–17u  </w:t>
-            </w:r>
-            <w:r>
-              <w:rPr>
-                <w:rFonts w:ascii="Segoe UI" w:hAnsi="Segoe UI"/>
-                <w:b/>
-                <w:i w:val="0"/>
-                <w:color w:val="A34A00"/>
-                <w:sz w:val="15"/>
-              </w:rPr>
-              <w:t>SEBIA 3–4, groep Oost en Brugge (2e podoloog)</w:t>
+              <w:t>Inhaalmoment SEBIA 3–4</w:t>
             </w:r>
             <w:r>
               <w:rPr>
                 <w:rFonts w:ascii="Segoe UI" w:hAnsi="Segoe UI"/>
                 <w:b w:val="0"/>
-                <w:i w:val="0"/>
+                <w:i/>
                 <w:color w:val="1B2630"/>
                 <w:sz w:val="15"/>
               </w:rPr>
-              <w:t xml:space="preserve"> · voorstel Leuven; nog voor te leggen aan Dobbels</w:t>
-            </w:r>
-          </w:p>
-        </w:tc>
-        <w:tc>
-          <w:tcPr>
-            <w:tcW w:type="dxa" w:w="2835"/>
-            <w:shd w:val="clear" w:color="auto" w:fill="FFE9D6"/>
-          </w:tcPr>
-          <w:p>
-            <w:pPr>
-              <w:spacing w:before="20" w:after="20"/>
-            </w:pPr>
-            <w:r>
-              <w:rPr>
-                <w:rFonts w:ascii="Segoe UI" w:hAnsi="Segoe UI"/>
-                <w:b/>
-                <w:i w:val="0"/>
-                <w:color w:val="5A6A78"/>
-                <w:sz w:val="15"/>
-              </w:rPr>
-              <w:t>10</w:t>
-            </w:r>
-          </w:p>
-          <w:p>
-            <w:pPr>
-              <w:spacing w:before="20" w:after="20"/>
-            </w:pPr>
-            <w:r>
-              <w:rPr>
-                <w:rFonts w:ascii="Segoe UI" w:hAnsi="Segoe UI"/>
-                <w:b/>
-                <w:i w:val="0"/>
-                <w:color w:val="A34A00"/>
-                <w:sz w:val="15"/>
-              </w:rPr>
-              <w:t xml:space="preserve">13u–17u  </w:t>
-            </w:r>
-            <w:r>
-              <w:rPr>
-                <w:rFonts w:ascii="Segoe UI" w:hAnsi="Segoe UI"/>
-                <w:b/>
-                <w:i w:val="0"/>
-                <w:color w:val="A34A00"/>
-                <w:sz w:val="15"/>
-              </w:rPr>
-              <w:t>SEBIA 3–4, Kortrijk en Brugge (1e podoloog)</w:t>
-            </w:r>
-            <w:r>
-              <w:rPr>
-                <w:rFonts w:ascii="Segoe UI" w:hAnsi="Segoe UI"/>
-                <w:b w:val="0"/>
-                <w:i w:val="0"/>
-                <w:color w:val="1B2630"/>
-                <w:sz w:val="15"/>
-              </w:rPr>
-              <w:t xml:space="preserve"> · nog voor te leggen aan Dobbels</w:t>
+              <w:t xml:space="preserve"> · Dobbels</w:t>
             </w:r>
           </w:p>
         </w:tc>
@@ -4968,14 +4990,13 @@
                 <w:color w:val="5A6A78"/>
                 <w:sz w:val="15"/>
               </w:rPr>
-              <w:t>11</w:t>
+              <w:t>9</w:t>
             </w:r>
           </w:p>
         </w:tc>
         <w:tc>
           <w:tcPr>
             <w:tcW w:type="dxa" w:w="2835"/>
-            <w:shd w:val="clear" w:color="auto" w:fill="FFE9D6"/>
           </w:tcPr>
           <w:p>
             <w:pPr>
@@ -4989,9 +5010,14 @@
                 <w:color w:val="5A6A78"/>
                 <w:sz w:val="15"/>
               </w:rPr>
-              <w:t>12</w:t>
+              <w:t>10</w:t>
             </w:r>
           </w:p>
+        </w:tc>
+        <w:tc>
+          <w:tcPr>
+            <w:tcW w:type="dxa" w:w="2835"/>
+          </w:tcPr>
           <w:p>
             <w:pPr>
               <w:spacing w:before="20" w:after="20"/>
@@ -5001,30 +5027,30 @@
                 <w:rFonts w:ascii="Segoe UI" w:hAnsi="Segoe UI"/>
                 <w:b/>
                 <w:i w:val="0"/>
-                <w:color w:val="A34A00"/>
-                <w:sz w:val="15"/>
-              </w:rPr>
-              <w:t xml:space="preserve">13u–17u  </w:t>
-            </w:r>
+                <w:color w:val="5A6A78"/>
+                <w:sz w:val="15"/>
+              </w:rPr>
+              <w:t>11</w:t>
+            </w:r>
+          </w:p>
+        </w:tc>
+        <w:tc>
+          <w:tcPr>
+            <w:tcW w:type="dxa" w:w="2835"/>
+          </w:tcPr>
+          <w:p>
+            <w:pPr>
+              <w:spacing w:before="20" w:after="20"/>
+            </w:pPr>
             <w:r>
               <w:rPr>
                 <w:rFonts w:ascii="Segoe UI" w:hAnsi="Segoe UI"/>
                 <w:b/>
                 <w:i w:val="0"/>
-                <w:color w:val="A34A00"/>
-                <w:sz w:val="15"/>
-              </w:rPr>
-              <w:t>SEBIA 3–4, Gent</w:t>
-            </w:r>
-            <w:r>
-              <w:rPr>
-                <w:rFonts w:ascii="Segoe UI" w:hAnsi="Segoe UI"/>
-                <w:b w:val="0"/>
-                <w:i w:val="0"/>
-                <w:color w:val="1B2630"/>
-                <w:sz w:val="15"/>
-              </w:rPr>
-              <w:t xml:space="preserve"> · UZ Gent; nog voor te leggen aan Dobbels</w:t>
+                <w:color w:val="5A6A78"/>
+                <w:sz w:val="15"/>
+              </w:rPr>
+              <w:t>12</w:t>
             </w:r>
           </w:p>
         </w:tc>
@@ -5056,7 +5082,6 @@
         <w:tc>
           <w:tcPr>
             <w:tcW w:type="dxa" w:w="2835"/>
-            <w:shd w:val="clear" w:color="auto" w:fill="FFE9D6"/>
           </w:tcPr>
           <w:p>
             <w:pPr>
@@ -5073,6 +5098,11 @@
               <w:t>15</w:t>
             </w:r>
           </w:p>
+        </w:tc>
+        <w:tc>
+          <w:tcPr>
+            <w:tcW w:type="dxa" w:w="2835"/>
+          </w:tcPr>
           <w:p>
             <w:pPr>
               <w:spacing w:before="20" w:after="20"/>
@@ -5082,17 +5112,16 @@
                 <w:rFonts w:ascii="Segoe UI" w:hAnsi="Segoe UI"/>
                 <w:b/>
                 <w:i w:val="0"/>
-                <w:color w:val="A34A00"/>
-                <w:sz w:val="15"/>
-              </w:rPr>
-              <w:t>SEBIA 5, 15 tot 26 mrt: 1,5 u per podoloog in het eigen centrum, met Dobbels, naar voorkeur van de podoloog</w:t>
+                <w:color w:val="5A6A78"/>
+                <w:sz w:val="15"/>
+              </w:rPr>
+              <w:t>16</w:t>
             </w:r>
           </w:p>
         </w:tc>
         <w:tc>
           <w:tcPr>
             <w:tcW w:type="dxa" w:w="2835"/>
-            <w:shd w:val="clear" w:color="auto" w:fill="FFE9D6"/>
           </w:tcPr>
           <w:p>
             <w:pPr>
@@ -5106,14 +5135,13 @@
                 <w:color w:val="5A6A78"/>
                 <w:sz w:val="15"/>
               </w:rPr>
-              <w:t>16</w:t>
+              <w:t>17</w:t>
             </w:r>
           </w:p>
         </w:tc>
         <w:tc>
           <w:tcPr>
             <w:tcW w:type="dxa" w:w="2835"/>
-            <w:shd w:val="clear" w:color="auto" w:fill="FFE9D6"/>
           </w:tcPr>
           <w:p>
             <w:pPr>
@@ -5127,35 +5155,13 @@
                 <w:color w:val="5A6A78"/>
                 <w:sz w:val="15"/>
               </w:rPr>
-              <w:t>17</w:t>
+              <w:t>18</w:t>
             </w:r>
           </w:p>
         </w:tc>
         <w:tc>
           <w:tcPr>
             <w:tcW w:type="dxa" w:w="2835"/>
-            <w:shd w:val="clear" w:color="auto" w:fill="FFE9D6"/>
-          </w:tcPr>
-          <w:p>
-            <w:pPr>
-              <w:spacing w:before="20" w:after="20"/>
-            </w:pPr>
-            <w:r>
-              <w:rPr>
-                <w:rFonts w:ascii="Segoe UI" w:hAnsi="Segoe UI"/>
-                <w:b/>
-                <w:i w:val="0"/>
-                <w:color w:val="5A6A78"/>
-                <w:sz w:val="15"/>
-              </w:rPr>
-              <w:t>18</w:t>
-            </w:r>
-          </w:p>
-        </w:tc>
-        <w:tc>
-          <w:tcPr>
-            <w:tcW w:type="dxa" w:w="2835"/>
-            <w:shd w:val="clear" w:color="auto" w:fill="FFE9D6"/>
           </w:tcPr>
           <w:p>
             <w:pPr>
@@ -5201,7 +5207,6 @@
         <w:tc>
           <w:tcPr>
             <w:tcW w:type="dxa" w:w="2835"/>
-            <w:shd w:val="clear" w:color="auto" w:fill="FFE9D6"/>
           </w:tcPr>
           <w:p>
             <w:pPr>
@@ -5222,7 +5227,6 @@
         <w:tc>
           <w:tcPr>
             <w:tcW w:type="dxa" w:w="2835"/>
-            <w:shd w:val="clear" w:color="auto" w:fill="FFE9D6"/>
           </w:tcPr>
           <w:p>
             <w:pPr>
@@ -5243,7 +5247,6 @@
         <w:tc>
           <w:tcPr>
             <w:tcW w:type="dxa" w:w="2835"/>
-            <w:shd w:val="clear" w:color="auto" w:fill="FFE9D6"/>
           </w:tcPr>
           <w:p>
             <w:pPr>
@@ -5264,7 +5267,6 @@
         <w:tc>
           <w:tcPr>
             <w:tcW w:type="dxa" w:w="2835"/>
-            <w:shd w:val="clear" w:color="auto" w:fill="FFE9D6"/>
           </w:tcPr>
           <w:p>
             <w:pPr>
@@ -5285,7 +5287,6 @@
         <w:tc>
           <w:tcPr>
             <w:tcW w:type="dxa" w:w="2835"/>
-            <w:shd w:val="clear" w:color="auto" w:fill="FFE9D6"/>
           </w:tcPr>
           <w:p>
             <w:pPr>
@@ -5444,8 +5445,1079 @@
       </w:tr>
     </w:tbl>
     <w:p>
+      <w:r>
+        <w:br w:type="page"/>
+      </w:r>
+    </w:p>
+    <w:p>
       <w:pPr>
-        <w:spacing w:before="60" w:after="20"/>
+        <w:keepNext/>
+        <w:spacing w:before="200" w:after="80"/>
+      </w:pPr>
+      <w:r>
+        <w:rPr>
+          <w:rFonts w:ascii="Segoe UI" w:hAnsi="Segoe UI"/>
+          <w:b/>
+          <w:i w:val="0"/>
+          <w:color w:val="FF7A00"/>
+          <w:sz w:val="22"/>
+        </w:rPr>
+        <w:t xml:space="preserve">6  </w:t>
+      </w:r>
+      <w:r>
+        <w:rPr>
+          <w:rFonts w:ascii="Segoe UI" w:hAnsi="Segoe UI"/>
+          <w:b/>
+          <w:i w:val="0"/>
+          <w:color w:val="00407A"/>
+          <w:sz w:val="22"/>
+        </w:rPr>
+        <w:t>April 2027</w:t>
+      </w:r>
+    </w:p>
+    <w:tbl>
+      <w:tblPr>
+        <w:tblW w:type="auto" w:w="0"/>
+        <w:jc w:val="left"/>
+        <w:tblLayout w:type="fixed"/>
+        <w:tblLook w:firstColumn="1" w:firstRow="1" w:lastColumn="0" w:lastRow="0" w:noHBand="0" w:noVBand="1" w:val="04A0"/>
+        <w:tblBorders>
+          <w:top w:val="single" w:sz="4" w:color="D8E2EA"/>
+          <w:left w:val="single" w:sz="4" w:color="D8E2EA"/>
+          <w:bottom w:val="single" w:sz="4" w:color="D8E2EA"/>
+          <w:right w:val="single" w:sz="4" w:color="D8E2EA"/>
+          <w:insideH w:val="single" w:sz="4" w:color="D8E2EA"/>
+          <w:insideV w:val="single" w:sz="4" w:color="D8E2EA"/>
+        </w:tblBorders>
+        <w:tblLayout w:type="fixed"/>
+      </w:tblPr>
+      <w:tblGrid>
+        <w:gridCol w:w="2523"/>
+        <w:gridCol w:w="2523"/>
+        <w:gridCol w:w="2523"/>
+        <w:gridCol w:w="2523"/>
+        <w:gridCol w:w="2523"/>
+        <w:gridCol w:w="2523"/>
+      </w:tblGrid>
+      <w:tr>
+        <w:tc>
+          <w:tcPr>
+            <w:tcW w:type="dxa" w:w="680"/>
+            <w:shd w:val="clear" w:color="auto" w:fill="1D8DB0"/>
+          </w:tcPr>
+          <w:p>
+            <w:pPr>
+              <w:spacing w:before="20" w:after="20"/>
+            </w:pPr>
+            <w:r>
+              <w:rPr>
+                <w:rFonts w:ascii="Segoe UI" w:hAnsi="Segoe UI"/>
+                <w:b/>
+                <w:i w:val="0"/>
+                <w:color w:val="FFFFFF"/>
+                <w:sz w:val="15"/>
+              </w:rPr>
+              <w:t>week</w:t>
+            </w:r>
+          </w:p>
+        </w:tc>
+        <w:tc>
+          <w:tcPr>
+            <w:tcW w:type="dxa" w:w="2835"/>
+            <w:shd w:val="clear" w:color="auto" w:fill="1D8DB0"/>
+          </w:tcPr>
+          <w:p>
+            <w:pPr>
+              <w:spacing w:before="20" w:after="20"/>
+            </w:pPr>
+            <w:r>
+              <w:rPr>
+                <w:rFonts w:ascii="Segoe UI" w:hAnsi="Segoe UI"/>
+                <w:b/>
+                <w:i w:val="0"/>
+                <w:color w:val="FFFFFF"/>
+                <w:sz w:val="15"/>
+              </w:rPr>
+              <w:t>ma</w:t>
+            </w:r>
+          </w:p>
+        </w:tc>
+        <w:tc>
+          <w:tcPr>
+            <w:tcW w:type="dxa" w:w="2835"/>
+            <w:shd w:val="clear" w:color="auto" w:fill="1D8DB0"/>
+          </w:tcPr>
+          <w:p>
+            <w:pPr>
+              <w:spacing w:before="20" w:after="20"/>
+            </w:pPr>
+            <w:r>
+              <w:rPr>
+                <w:rFonts w:ascii="Segoe UI" w:hAnsi="Segoe UI"/>
+                <w:b/>
+                <w:i w:val="0"/>
+                <w:color w:val="FFFFFF"/>
+                <w:sz w:val="15"/>
+              </w:rPr>
+              <w:t>di</w:t>
+            </w:r>
+          </w:p>
+        </w:tc>
+        <w:tc>
+          <w:tcPr>
+            <w:tcW w:type="dxa" w:w="2835"/>
+            <w:shd w:val="clear" w:color="auto" w:fill="1D8DB0"/>
+          </w:tcPr>
+          <w:p>
+            <w:pPr>
+              <w:spacing w:before="20" w:after="20"/>
+            </w:pPr>
+            <w:r>
+              <w:rPr>
+                <w:rFonts w:ascii="Segoe UI" w:hAnsi="Segoe UI"/>
+                <w:b/>
+                <w:i w:val="0"/>
+                <w:color w:val="FFFFFF"/>
+                <w:sz w:val="15"/>
+              </w:rPr>
+              <w:t>wo</w:t>
+            </w:r>
+          </w:p>
+        </w:tc>
+        <w:tc>
+          <w:tcPr>
+            <w:tcW w:type="dxa" w:w="2835"/>
+            <w:shd w:val="clear" w:color="auto" w:fill="1D8DB0"/>
+          </w:tcPr>
+          <w:p>
+            <w:pPr>
+              <w:spacing w:before="20" w:after="20"/>
+            </w:pPr>
+            <w:r>
+              <w:rPr>
+                <w:rFonts w:ascii="Segoe UI" w:hAnsi="Segoe UI"/>
+                <w:b/>
+                <w:i w:val="0"/>
+                <w:color w:val="FFFFFF"/>
+                <w:sz w:val="15"/>
+              </w:rPr>
+              <w:t>do</w:t>
+            </w:r>
+          </w:p>
+        </w:tc>
+        <w:tc>
+          <w:tcPr>
+            <w:tcW w:type="dxa" w:w="2835"/>
+            <w:shd w:val="clear" w:color="auto" w:fill="1D8DB0"/>
+          </w:tcPr>
+          <w:p>
+            <w:pPr>
+              <w:spacing w:before="20" w:after="20"/>
+            </w:pPr>
+            <w:r>
+              <w:rPr>
+                <w:rFonts w:ascii="Segoe UI" w:hAnsi="Segoe UI"/>
+                <w:b/>
+                <w:i w:val="0"/>
+                <w:color w:val="FFFFFF"/>
+                <w:sz w:val="15"/>
+              </w:rPr>
+              <w:t>vr</w:t>
+            </w:r>
+          </w:p>
+        </w:tc>
+      </w:tr>
+      <w:tr>
+        <w:trPr>
+          <w:cantSplit/>
+        </w:trPr>
+        <w:tc>
+          <w:tcPr>
+            <w:tcW w:type="dxa" w:w="680"/>
+          </w:tcPr>
+          <w:p>
+            <w:pPr>
+              <w:spacing w:before="20" w:after="20"/>
+            </w:pPr>
+            <w:r>
+              <w:rPr>
+                <w:rFonts w:ascii="Segoe UI" w:hAnsi="Segoe UI"/>
+                <w:b w:val="0"/>
+                <w:i w:val="0"/>
+                <w:color w:val="5A6A78"/>
+                <w:sz w:val="15"/>
+              </w:rPr>
+              <w:t>13</w:t>
+            </w:r>
+          </w:p>
+        </w:tc>
+        <w:tc>
+          <w:tcPr>
+            <w:tcW w:type="dxa" w:w="2835"/>
+          </w:tcPr>
+          <w:p>
+            <w:pPr>
+              <w:spacing w:before="20" w:after="20"/>
+            </w:pPr>
+          </w:p>
+        </w:tc>
+        <w:tc>
+          <w:tcPr>
+            <w:tcW w:type="dxa" w:w="2835"/>
+          </w:tcPr>
+          <w:p>
+            <w:pPr>
+              <w:spacing w:before="20" w:after="20"/>
+            </w:pPr>
+          </w:p>
+        </w:tc>
+        <w:tc>
+          <w:tcPr>
+            <w:tcW w:type="dxa" w:w="2835"/>
+          </w:tcPr>
+          <w:p>
+            <w:pPr>
+              <w:spacing w:before="20" w:after="20"/>
+            </w:pPr>
+          </w:p>
+        </w:tc>
+        <w:tc>
+          <w:tcPr>
+            <w:tcW w:type="dxa" w:w="2835"/>
+            <w:shd w:val="clear" w:color="auto" w:fill="F1F1F1"/>
+          </w:tcPr>
+          <w:p>
+            <w:pPr>
+              <w:spacing w:before="20" w:after="20"/>
+            </w:pPr>
+            <w:r>
+              <w:rPr>
+                <w:rFonts w:ascii="Segoe UI" w:hAnsi="Segoe UI"/>
+                <w:b/>
+                <w:i w:val="0"/>
+                <w:color w:val="5A6A78"/>
+                <w:sz w:val="15"/>
+              </w:rPr>
+              <w:t>1</w:t>
+            </w:r>
+            <w:r>
+              <w:rPr>
+                <w:rFonts w:ascii="Segoe UI" w:hAnsi="Segoe UI"/>
+                <w:b w:val="0"/>
+                <w:i/>
+                <w:color w:val="5A6A78"/>
+                <w:sz w:val="15"/>
+              </w:rPr>
+              <w:t xml:space="preserve">  paasvakantie</w:t>
+            </w:r>
+          </w:p>
+        </w:tc>
+        <w:tc>
+          <w:tcPr>
+            <w:tcW w:type="dxa" w:w="2835"/>
+            <w:shd w:val="clear" w:color="auto" w:fill="F1F1F1"/>
+          </w:tcPr>
+          <w:p>
+            <w:pPr>
+              <w:spacing w:before="20" w:after="20"/>
+            </w:pPr>
+            <w:r>
+              <w:rPr>
+                <w:rFonts w:ascii="Segoe UI" w:hAnsi="Segoe UI"/>
+                <w:b/>
+                <w:i w:val="0"/>
+                <w:color w:val="5A6A78"/>
+                <w:sz w:val="15"/>
+              </w:rPr>
+              <w:t>2</w:t>
+            </w:r>
+            <w:r>
+              <w:rPr>
+                <w:rFonts w:ascii="Segoe UI" w:hAnsi="Segoe UI"/>
+                <w:b w:val="0"/>
+                <w:i/>
+                <w:color w:val="5A6A78"/>
+                <w:sz w:val="15"/>
+              </w:rPr>
+              <w:t xml:space="preserve">  paasvakantie</w:t>
+            </w:r>
+          </w:p>
+        </w:tc>
+      </w:tr>
+      <w:tr>
+        <w:trPr>
+          <w:cantSplit/>
+        </w:trPr>
+        <w:tc>
+          <w:tcPr>
+            <w:tcW w:type="dxa" w:w="680"/>
+          </w:tcPr>
+          <w:p>
+            <w:pPr>
+              <w:spacing w:before="20" w:after="20"/>
+            </w:pPr>
+            <w:r>
+              <w:rPr>
+                <w:rFonts w:ascii="Segoe UI" w:hAnsi="Segoe UI"/>
+                <w:b w:val="0"/>
+                <w:i w:val="0"/>
+                <w:color w:val="5A6A78"/>
+                <w:sz w:val="15"/>
+              </w:rPr>
+              <w:t>14</w:t>
+            </w:r>
+          </w:p>
+        </w:tc>
+        <w:tc>
+          <w:tcPr>
+            <w:tcW w:type="dxa" w:w="2835"/>
+            <w:shd w:val="clear" w:color="auto" w:fill="F1F1F1"/>
+          </w:tcPr>
+          <w:p>
+            <w:pPr>
+              <w:spacing w:before="20" w:after="20"/>
+            </w:pPr>
+            <w:r>
+              <w:rPr>
+                <w:rFonts w:ascii="Segoe UI" w:hAnsi="Segoe UI"/>
+                <w:b/>
+                <w:i w:val="0"/>
+                <w:color w:val="5A6A78"/>
+                <w:sz w:val="15"/>
+              </w:rPr>
+              <w:t>5</w:t>
+            </w:r>
+            <w:r>
+              <w:rPr>
+                <w:rFonts w:ascii="Segoe UI" w:hAnsi="Segoe UI"/>
+                <w:b w:val="0"/>
+                <w:i/>
+                <w:color w:val="5A6A78"/>
+                <w:sz w:val="15"/>
+              </w:rPr>
+              <w:t xml:space="preserve">  paasvakantie</w:t>
+            </w:r>
+          </w:p>
+        </w:tc>
+        <w:tc>
+          <w:tcPr>
+            <w:tcW w:type="dxa" w:w="2835"/>
+            <w:shd w:val="clear" w:color="auto" w:fill="F1F1F1"/>
+          </w:tcPr>
+          <w:p>
+            <w:pPr>
+              <w:spacing w:before="20" w:after="20"/>
+            </w:pPr>
+            <w:r>
+              <w:rPr>
+                <w:rFonts w:ascii="Segoe UI" w:hAnsi="Segoe UI"/>
+                <w:b/>
+                <w:i w:val="0"/>
+                <w:color w:val="5A6A78"/>
+                <w:sz w:val="15"/>
+              </w:rPr>
+              <w:t>6</w:t>
+            </w:r>
+            <w:r>
+              <w:rPr>
+                <w:rFonts w:ascii="Segoe UI" w:hAnsi="Segoe UI"/>
+                <w:b w:val="0"/>
+                <w:i/>
+                <w:color w:val="5A6A78"/>
+                <w:sz w:val="15"/>
+              </w:rPr>
+              <w:t xml:space="preserve">  paasvakantie</w:t>
+            </w:r>
+          </w:p>
+        </w:tc>
+        <w:tc>
+          <w:tcPr>
+            <w:tcW w:type="dxa" w:w="2835"/>
+            <w:shd w:val="clear" w:color="auto" w:fill="F1F1F1"/>
+          </w:tcPr>
+          <w:p>
+            <w:pPr>
+              <w:spacing w:before="20" w:after="20"/>
+            </w:pPr>
+            <w:r>
+              <w:rPr>
+                <w:rFonts w:ascii="Segoe UI" w:hAnsi="Segoe UI"/>
+                <w:b/>
+                <w:i w:val="0"/>
+                <w:color w:val="5A6A78"/>
+                <w:sz w:val="15"/>
+              </w:rPr>
+              <w:t>7</w:t>
+            </w:r>
+            <w:r>
+              <w:rPr>
+                <w:rFonts w:ascii="Segoe UI" w:hAnsi="Segoe UI"/>
+                <w:b w:val="0"/>
+                <w:i/>
+                <w:color w:val="5A6A78"/>
+                <w:sz w:val="15"/>
+              </w:rPr>
+              <w:t xml:space="preserve">  paasvakantie</w:t>
+            </w:r>
+          </w:p>
+        </w:tc>
+        <w:tc>
+          <w:tcPr>
+            <w:tcW w:type="dxa" w:w="2835"/>
+            <w:shd w:val="clear" w:color="auto" w:fill="F1F1F1"/>
+          </w:tcPr>
+          <w:p>
+            <w:pPr>
+              <w:spacing w:before="20" w:after="20"/>
+            </w:pPr>
+            <w:r>
+              <w:rPr>
+                <w:rFonts w:ascii="Segoe UI" w:hAnsi="Segoe UI"/>
+                <w:b/>
+                <w:i w:val="0"/>
+                <w:color w:val="5A6A78"/>
+                <w:sz w:val="15"/>
+              </w:rPr>
+              <w:t>8</w:t>
+            </w:r>
+            <w:r>
+              <w:rPr>
+                <w:rFonts w:ascii="Segoe UI" w:hAnsi="Segoe UI"/>
+                <w:b w:val="0"/>
+                <w:i/>
+                <w:color w:val="5A6A78"/>
+                <w:sz w:val="15"/>
+              </w:rPr>
+              <w:t xml:space="preserve">  paasvakantie</w:t>
+            </w:r>
+          </w:p>
+        </w:tc>
+        <w:tc>
+          <w:tcPr>
+            <w:tcW w:type="dxa" w:w="2835"/>
+            <w:shd w:val="clear" w:color="auto" w:fill="F1F1F1"/>
+          </w:tcPr>
+          <w:p>
+            <w:pPr>
+              <w:spacing w:before="20" w:after="20"/>
+            </w:pPr>
+            <w:r>
+              <w:rPr>
+                <w:rFonts w:ascii="Segoe UI" w:hAnsi="Segoe UI"/>
+                <w:b/>
+                <w:i w:val="0"/>
+                <w:color w:val="5A6A78"/>
+                <w:sz w:val="15"/>
+              </w:rPr>
+              <w:t>9</w:t>
+            </w:r>
+            <w:r>
+              <w:rPr>
+                <w:rFonts w:ascii="Segoe UI" w:hAnsi="Segoe UI"/>
+                <w:b w:val="0"/>
+                <w:i/>
+                <w:color w:val="5A6A78"/>
+                <w:sz w:val="15"/>
+              </w:rPr>
+              <w:t xml:space="preserve">  paasvakantie</w:t>
+            </w:r>
+          </w:p>
+        </w:tc>
+      </w:tr>
+      <w:tr>
+        <w:trPr>
+          <w:cantSplit/>
+        </w:trPr>
+        <w:tc>
+          <w:tcPr>
+            <w:tcW w:type="dxa" w:w="680"/>
+          </w:tcPr>
+          <w:p>
+            <w:pPr>
+              <w:spacing w:before="20" w:after="20"/>
+            </w:pPr>
+            <w:r>
+              <w:rPr>
+                <w:rFonts w:ascii="Segoe UI" w:hAnsi="Segoe UI"/>
+                <w:b w:val="0"/>
+                <w:i w:val="0"/>
+                <w:color w:val="5A6A78"/>
+                <w:sz w:val="15"/>
+              </w:rPr>
+              <w:t>15</w:t>
+            </w:r>
+          </w:p>
+        </w:tc>
+        <w:tc>
+          <w:tcPr>
+            <w:tcW w:type="dxa" w:w="2835"/>
+          </w:tcPr>
+          <w:p>
+            <w:pPr>
+              <w:spacing w:before="20" w:after="20"/>
+            </w:pPr>
+            <w:r>
+              <w:rPr>
+                <w:rFonts w:ascii="Segoe UI" w:hAnsi="Segoe UI"/>
+                <w:b/>
+                <w:i w:val="0"/>
+                <w:color w:val="5A6A78"/>
+                <w:sz w:val="15"/>
+              </w:rPr>
+              <w:t>12</w:t>
+            </w:r>
+          </w:p>
+        </w:tc>
+        <w:tc>
+          <w:tcPr>
+            <w:tcW w:type="dxa" w:w="2835"/>
+          </w:tcPr>
+          <w:p>
+            <w:pPr>
+              <w:spacing w:before="20" w:after="20"/>
+            </w:pPr>
+            <w:r>
+              <w:rPr>
+                <w:rFonts w:ascii="Segoe UI" w:hAnsi="Segoe UI"/>
+                <w:b/>
+                <w:i w:val="0"/>
+                <w:color w:val="5A6A78"/>
+                <w:sz w:val="15"/>
+              </w:rPr>
+              <w:t>13</w:t>
+            </w:r>
+          </w:p>
+        </w:tc>
+        <w:tc>
+          <w:tcPr>
+            <w:tcW w:type="dxa" w:w="2835"/>
+          </w:tcPr>
+          <w:p>
+            <w:pPr>
+              <w:spacing w:before="20" w:after="20"/>
+            </w:pPr>
+            <w:r>
+              <w:rPr>
+                <w:rFonts w:ascii="Segoe UI" w:hAnsi="Segoe UI"/>
+                <w:b/>
+                <w:i w:val="0"/>
+                <w:color w:val="5A6A78"/>
+                <w:sz w:val="15"/>
+              </w:rPr>
+              <w:t>14</w:t>
+            </w:r>
+          </w:p>
+        </w:tc>
+        <w:tc>
+          <w:tcPr>
+            <w:tcW w:type="dxa" w:w="2835"/>
+          </w:tcPr>
+          <w:p>
+            <w:pPr>
+              <w:spacing w:before="20" w:after="20"/>
+            </w:pPr>
+            <w:r>
+              <w:rPr>
+                <w:rFonts w:ascii="Segoe UI" w:hAnsi="Segoe UI"/>
+                <w:b/>
+                <w:i w:val="0"/>
+                <w:color w:val="5A6A78"/>
+                <w:sz w:val="15"/>
+              </w:rPr>
+              <w:t>15</w:t>
+            </w:r>
+          </w:p>
+        </w:tc>
+        <w:tc>
+          <w:tcPr>
+            <w:tcW w:type="dxa" w:w="2835"/>
+          </w:tcPr>
+          <w:p>
+            <w:pPr>
+              <w:spacing w:before="20" w:after="20"/>
+            </w:pPr>
+            <w:r>
+              <w:rPr>
+                <w:rFonts w:ascii="Segoe UI" w:hAnsi="Segoe UI"/>
+                <w:b/>
+                <w:i w:val="0"/>
+                <w:color w:val="5A6A78"/>
+                <w:sz w:val="15"/>
+              </w:rPr>
+              <w:t>16</w:t>
+            </w:r>
+          </w:p>
+        </w:tc>
+      </w:tr>
+      <w:tr>
+        <w:trPr>
+          <w:cantSplit/>
+        </w:trPr>
+        <w:tc>
+          <w:tcPr>
+            <w:tcW w:type="dxa" w:w="680"/>
+          </w:tcPr>
+          <w:p>
+            <w:pPr>
+              <w:spacing w:before="20" w:after="20"/>
+            </w:pPr>
+            <w:r>
+              <w:rPr>
+                <w:rFonts w:ascii="Segoe UI" w:hAnsi="Segoe UI"/>
+                <w:b w:val="0"/>
+                <w:i w:val="0"/>
+                <w:color w:val="5A6A78"/>
+                <w:sz w:val="15"/>
+              </w:rPr>
+              <w:t>16</w:t>
+            </w:r>
+          </w:p>
+        </w:tc>
+        <w:tc>
+          <w:tcPr>
+            <w:tcW w:type="dxa" w:w="2835"/>
+          </w:tcPr>
+          <w:p>
+            <w:pPr>
+              <w:spacing w:before="20" w:after="20"/>
+            </w:pPr>
+            <w:r>
+              <w:rPr>
+                <w:rFonts w:ascii="Segoe UI" w:hAnsi="Segoe UI"/>
+                <w:b/>
+                <w:i w:val="0"/>
+                <w:color w:val="5A6A78"/>
+                <w:sz w:val="15"/>
+              </w:rPr>
+              <w:t>19</w:t>
+            </w:r>
+          </w:p>
+        </w:tc>
+        <w:tc>
+          <w:tcPr>
+            <w:tcW w:type="dxa" w:w="2835"/>
+            <w:shd w:val="clear" w:color="auto" w:fill="FFE9D6"/>
+          </w:tcPr>
+          <w:p>
+            <w:pPr>
+              <w:spacing w:before="20" w:after="20"/>
+            </w:pPr>
+            <w:r>
+              <w:rPr>
+                <w:rFonts w:ascii="Segoe UI" w:hAnsi="Segoe UI"/>
+                <w:b/>
+                <w:i w:val="0"/>
+                <w:color w:val="5A6A78"/>
+                <w:sz w:val="15"/>
+              </w:rPr>
+              <w:t>20</w:t>
+            </w:r>
+          </w:p>
+          <w:p>
+            <w:pPr>
+              <w:spacing w:before="20" w:after="20"/>
+            </w:pPr>
+            <w:r>
+              <w:rPr>
+                <w:rFonts w:ascii="Segoe UI" w:hAnsi="Segoe UI"/>
+                <w:b/>
+                <w:i w:val="0"/>
+                <w:color w:val="A34A00"/>
+                <w:sz w:val="15"/>
+              </w:rPr>
+              <w:t xml:space="preserve">VM  </w:t>
+            </w:r>
+            <w:r>
+              <w:rPr>
+                <w:rFonts w:ascii="Segoe UI" w:hAnsi="Segoe UI"/>
+                <w:b/>
+                <w:i w:val="0"/>
+                <w:color w:val="A34A00"/>
+                <w:sz w:val="15"/>
+              </w:rPr>
+              <w:t>SEBIA 5</w:t>
+            </w:r>
+            <w:r>
+              <w:rPr>
+                <w:rFonts w:ascii="Segoe UI" w:hAnsi="Segoe UI"/>
+                <w:b w:val="0"/>
+                <w:i w:val="0"/>
+                <w:color w:val="1B2630"/>
+                <w:sz w:val="15"/>
+              </w:rPr>
+              <w:t xml:space="preserve"> · AZ Groeninge Kortrijk</w:t>
+            </w:r>
+          </w:p>
+          <w:p>
+            <w:pPr>
+              <w:spacing w:before="20" w:after="20"/>
+            </w:pPr>
+            <w:r>
+              <w:rPr>
+                <w:rFonts w:ascii="Segoe UI" w:hAnsi="Segoe UI"/>
+                <w:b/>
+                <w:i w:val="0"/>
+                <w:color w:val="A34A00"/>
+                <w:sz w:val="15"/>
+              </w:rPr>
+              <w:t xml:space="preserve">NM  </w:t>
+            </w:r>
+            <w:r>
+              <w:rPr>
+                <w:rFonts w:ascii="Segoe UI" w:hAnsi="Segoe UI"/>
+                <w:b/>
+                <w:i w:val="0"/>
+                <w:color w:val="A34A00"/>
+                <w:sz w:val="15"/>
+              </w:rPr>
+              <w:t>SEBIA 5</w:t>
+            </w:r>
+            <w:r>
+              <w:rPr>
+                <w:rFonts w:ascii="Segoe UI" w:hAnsi="Segoe UI"/>
+                <w:b w:val="0"/>
+                <w:i w:val="0"/>
+                <w:color w:val="1B2630"/>
+                <w:sz w:val="15"/>
+              </w:rPr>
+              <w:t xml:space="preserve"> · AZORG Aalst</w:t>
+            </w:r>
+          </w:p>
+        </w:tc>
+        <w:tc>
+          <w:tcPr>
+            <w:tcW w:type="dxa" w:w="2835"/>
+          </w:tcPr>
+          <w:p>
+            <w:pPr>
+              <w:spacing w:before="20" w:after="20"/>
+            </w:pPr>
+            <w:r>
+              <w:rPr>
+                <w:rFonts w:ascii="Segoe UI" w:hAnsi="Segoe UI"/>
+                <w:b/>
+                <w:i w:val="0"/>
+                <w:color w:val="5A6A78"/>
+                <w:sz w:val="15"/>
+              </w:rPr>
+              <w:t>21</w:t>
+            </w:r>
+          </w:p>
+        </w:tc>
+        <w:tc>
+          <w:tcPr>
+            <w:tcW w:type="dxa" w:w="2835"/>
+          </w:tcPr>
+          <w:p>
+            <w:pPr>
+              <w:spacing w:before="20" w:after="20"/>
+            </w:pPr>
+            <w:r>
+              <w:rPr>
+                <w:rFonts w:ascii="Segoe UI" w:hAnsi="Segoe UI"/>
+                <w:b/>
+                <w:i w:val="0"/>
+                <w:color w:val="5A6A78"/>
+                <w:sz w:val="15"/>
+              </w:rPr>
+              <w:t>22</w:t>
+            </w:r>
+          </w:p>
+        </w:tc>
+        <w:tc>
+          <w:tcPr>
+            <w:tcW w:type="dxa" w:w="2835"/>
+            <w:shd w:val="clear" w:color="auto" w:fill="FFE9D6"/>
+          </w:tcPr>
+          <w:p>
+            <w:pPr>
+              <w:spacing w:before="20" w:after="20"/>
+            </w:pPr>
+            <w:r>
+              <w:rPr>
+                <w:rFonts w:ascii="Segoe UI" w:hAnsi="Segoe UI"/>
+                <w:b/>
+                <w:i w:val="0"/>
+                <w:color w:val="5A6A78"/>
+                <w:sz w:val="15"/>
+              </w:rPr>
+              <w:t>23</w:t>
+            </w:r>
+          </w:p>
+          <w:p>
+            <w:pPr>
+              <w:spacing w:before="20" w:after="20"/>
+            </w:pPr>
+            <w:r>
+              <w:rPr>
+                <w:rFonts w:ascii="Segoe UI" w:hAnsi="Segoe UI"/>
+                <w:b/>
+                <w:i w:val="0"/>
+                <w:color w:val="A34A00"/>
+                <w:sz w:val="15"/>
+              </w:rPr>
+              <w:t xml:space="preserve">NM  </w:t>
+            </w:r>
+            <w:r>
+              <w:rPr>
+                <w:rFonts w:ascii="Segoe UI" w:hAnsi="Segoe UI"/>
+                <w:b/>
+                <w:i w:val="0"/>
+                <w:color w:val="A34A00"/>
+                <w:sz w:val="15"/>
+              </w:rPr>
+              <w:t>SEBIA 5</w:t>
+            </w:r>
+            <w:r>
+              <w:rPr>
+                <w:rFonts w:ascii="Segoe UI" w:hAnsi="Segoe UI"/>
+                <w:b w:val="0"/>
+                <w:i w:val="0"/>
+                <w:color w:val="1B2630"/>
+                <w:sz w:val="15"/>
+              </w:rPr>
+              <w:t xml:space="preserve"> · UZ Gent</w:t>
+            </w:r>
+          </w:p>
+        </w:tc>
+      </w:tr>
+      <w:tr>
+        <w:trPr>
+          <w:cantSplit/>
+        </w:trPr>
+        <w:tc>
+          <w:tcPr>
+            <w:tcW w:type="dxa" w:w="680"/>
+          </w:tcPr>
+          <w:p>
+            <w:pPr>
+              <w:spacing w:before="20" w:after="20"/>
+            </w:pPr>
+            <w:r>
+              <w:rPr>
+                <w:rFonts w:ascii="Segoe UI" w:hAnsi="Segoe UI"/>
+                <w:b w:val="0"/>
+                <w:i w:val="0"/>
+                <w:color w:val="5A6A78"/>
+                <w:sz w:val="15"/>
+              </w:rPr>
+              <w:t>17</w:t>
+            </w:r>
+          </w:p>
+        </w:tc>
+        <w:tc>
+          <w:tcPr>
+            <w:tcW w:type="dxa" w:w="2835"/>
+            <w:shd w:val="clear" w:color="auto" w:fill="FFE9D6"/>
+          </w:tcPr>
+          <w:p>
+            <w:pPr>
+              <w:spacing w:before="20" w:after="20"/>
+            </w:pPr>
+            <w:r>
+              <w:rPr>
+                <w:rFonts w:ascii="Segoe UI" w:hAnsi="Segoe UI"/>
+                <w:b/>
+                <w:i w:val="0"/>
+                <w:color w:val="5A6A78"/>
+                <w:sz w:val="15"/>
+              </w:rPr>
+              <w:t>26</w:t>
+            </w:r>
+          </w:p>
+          <w:p>
+            <w:pPr>
+              <w:spacing w:before="20" w:after="20"/>
+            </w:pPr>
+            <w:r>
+              <w:rPr>
+                <w:rFonts w:ascii="Segoe UI" w:hAnsi="Segoe UI"/>
+                <w:b/>
+                <w:i w:val="0"/>
+                <w:color w:val="A34A00"/>
+                <w:sz w:val="15"/>
+              </w:rPr>
+              <w:t xml:space="preserve">VM  </w:t>
+            </w:r>
+            <w:r>
+              <w:rPr>
+                <w:rFonts w:ascii="Segoe UI" w:hAnsi="Segoe UI"/>
+                <w:b/>
+                <w:i w:val="0"/>
+                <w:color w:val="A34A00"/>
+                <w:sz w:val="15"/>
+              </w:rPr>
+              <w:t>SEBIA 5</w:t>
+            </w:r>
+            <w:r>
+              <w:rPr>
+                <w:rFonts w:ascii="Segoe UI" w:hAnsi="Segoe UI"/>
+                <w:b w:val="0"/>
+                <w:i w:val="0"/>
+                <w:color w:val="1B2630"/>
+                <w:sz w:val="15"/>
+              </w:rPr>
+              <w:t xml:space="preserve"> · AZ Sint-Jan Brugge</w:t>
+            </w:r>
+          </w:p>
+        </w:tc>
+        <w:tc>
+          <w:tcPr>
+            <w:tcW w:type="dxa" w:w="2835"/>
+            <w:shd w:val="clear" w:color="auto" w:fill="FFE9D6"/>
+          </w:tcPr>
+          <w:p>
+            <w:pPr>
+              <w:spacing w:before="20" w:after="20"/>
+            </w:pPr>
+            <w:r>
+              <w:rPr>
+                <w:rFonts w:ascii="Segoe UI" w:hAnsi="Segoe UI"/>
+                <w:b/>
+                <w:i w:val="0"/>
+                <w:color w:val="5A6A78"/>
+                <w:sz w:val="15"/>
+              </w:rPr>
+              <w:t>27</w:t>
+            </w:r>
+          </w:p>
+          <w:p>
+            <w:pPr>
+              <w:spacing w:before="20" w:after="20"/>
+            </w:pPr>
+            <w:r>
+              <w:rPr>
+                <w:rFonts w:ascii="Segoe UI" w:hAnsi="Segoe UI"/>
+                <w:b/>
+                <w:i w:val="0"/>
+                <w:color w:val="A34A00"/>
+                <w:sz w:val="15"/>
+              </w:rPr>
+              <w:t xml:space="preserve">VM  </w:t>
+            </w:r>
+            <w:r>
+              <w:rPr>
+                <w:rFonts w:ascii="Segoe UI" w:hAnsi="Segoe UI"/>
+                <w:b/>
+                <w:i w:val="0"/>
+                <w:color w:val="A34A00"/>
+                <w:sz w:val="15"/>
+              </w:rPr>
+              <w:t>SEBIA 5</w:t>
+            </w:r>
+            <w:r>
+              <w:rPr>
+                <w:rFonts w:ascii="Segoe UI" w:hAnsi="Segoe UI"/>
+                <w:b w:val="0"/>
+                <w:i w:val="0"/>
+                <w:color w:val="1B2630"/>
+                <w:sz w:val="15"/>
+              </w:rPr>
+              <w:t xml:space="preserve"> · UZ Antwerpen</w:t>
+            </w:r>
+          </w:p>
+        </w:tc>
+        <w:tc>
+          <w:tcPr>
+            <w:tcW w:type="dxa" w:w="2835"/>
+          </w:tcPr>
+          <w:p>
+            <w:pPr>
+              <w:spacing w:before="20" w:after="20"/>
+            </w:pPr>
+            <w:r>
+              <w:rPr>
+                <w:rFonts w:ascii="Segoe UI" w:hAnsi="Segoe UI"/>
+                <w:b/>
+                <w:i w:val="0"/>
+                <w:color w:val="5A6A78"/>
+                <w:sz w:val="15"/>
+              </w:rPr>
+              <w:t>28</w:t>
+            </w:r>
+          </w:p>
+        </w:tc>
+        <w:tc>
+          <w:tcPr>
+            <w:tcW w:type="dxa" w:w="2835"/>
+          </w:tcPr>
+          <w:p>
+            <w:pPr>
+              <w:spacing w:before="20" w:after="20"/>
+            </w:pPr>
+            <w:r>
+              <w:rPr>
+                <w:rFonts w:ascii="Segoe UI" w:hAnsi="Segoe UI"/>
+                <w:b/>
+                <w:i w:val="0"/>
+                <w:color w:val="5A6A78"/>
+                <w:sz w:val="15"/>
+              </w:rPr>
+              <w:t>29</w:t>
+            </w:r>
+          </w:p>
+        </w:tc>
+        <w:tc>
+          <w:tcPr>
+            <w:tcW w:type="dxa" w:w="2835"/>
+            <w:shd w:val="clear" w:color="auto" w:fill="FFE9D6"/>
+          </w:tcPr>
+          <w:p>
+            <w:pPr>
+              <w:spacing w:before="20" w:after="20"/>
+            </w:pPr>
+            <w:r>
+              <w:rPr>
+                <w:rFonts w:ascii="Segoe UI" w:hAnsi="Segoe UI"/>
+                <w:b/>
+                <w:i w:val="0"/>
+                <w:color w:val="5A6A78"/>
+                <w:sz w:val="15"/>
+              </w:rPr>
+              <w:t>30</w:t>
+            </w:r>
+          </w:p>
+          <w:p>
+            <w:pPr>
+              <w:spacing w:before="20" w:after="20"/>
+            </w:pPr>
+            <w:r>
+              <w:rPr>
+                <w:rFonts w:ascii="Segoe UI" w:hAnsi="Segoe UI"/>
+                <w:b/>
+                <w:i w:val="0"/>
+                <w:color w:val="A34A00"/>
+                <w:sz w:val="15"/>
+              </w:rPr>
+              <w:t xml:space="preserve">VM  </w:t>
+            </w:r>
+            <w:r>
+              <w:rPr>
+                <w:rFonts w:ascii="Segoe UI" w:hAnsi="Segoe UI"/>
+                <w:b/>
+                <w:i w:val="0"/>
+                <w:color w:val="A34A00"/>
+                <w:sz w:val="15"/>
+              </w:rPr>
+              <w:t>SEBIA 5</w:t>
+            </w:r>
+            <w:r>
+              <w:rPr>
+                <w:rFonts w:ascii="Segoe UI" w:hAnsi="Segoe UI"/>
+                <w:b w:val="0"/>
+                <w:i w:val="0"/>
+                <w:color w:val="1B2630"/>
+                <w:sz w:val="15"/>
+              </w:rPr>
+              <w:t xml:space="preserve"> · UZ Leuven</w:t>
+            </w:r>
+          </w:p>
+        </w:tc>
+      </w:tr>
+    </w:tbl>
+    <w:p>
+      <w:pPr>
+        <w:spacing w:before="80" w:after="40"/>
       </w:pPr>
       <w:r>
         <w:rPr>
@@ -5453,9 +6525,9 @@
           <w:b/>
           <w:i w:val="0"/>
           <w:color w:val="00407A"/>
-          <w:sz w:val="16"/>
+          <w:sz w:val="17"/>
         </w:rPr>
-        <w:t xml:space="preserve">Optie B, als optie A niet lukt: </w:t>
+        <w:t xml:space="preserve">SEBIA 5: </w:t>
       </w:r>
       <w:r>
         <w:rPr>
@@ -5463,15 +6535,10 @@
           <w:b w:val="0"/>
           <w:i w:val="0"/>
           <w:color w:val="1B2630"/>
-          <w:sz w:val="16"/>
+          <w:sz w:val="17"/>
         </w:rPr>
-        <w:t>di 23 mrt, 13u–17u: SEBIA 3–4, groep Oost, in plaats van di 9 mrt. wo 24 mrt, 13u–17u: SEBIA 3–4, Kortrijk en Brugge, in plaats van wo 10 mrt. vr 26 mrt, 13u–17u: SEBIA 3–4, Gent, in plaats van vr 12 mrt.</w:t>
+        <w:t xml:space="preserve">1,5 u per podoloog in het eigen centrum, door Dobbels, tussen 20 en 30 april; de dag per centrum is een voorstel. SEBIA 3–4 heeft één inhaalmoment, ma 8 maart. </w:t>
       </w:r>
-    </w:p>
-    <w:p>
-      <w:pPr>
-        <w:spacing w:before="80" w:after="40"/>
-      </w:pPr>
       <w:r>
         <w:rPr>
           <w:rFonts w:ascii="Segoe UI" w:hAnsi="Segoe UI"/>
@@ -5490,7 +6557,7 @@
           <w:color w:val="1B2630"/>
           <w:sz w:val="17"/>
         </w:rPr>
-        <w:t>SEBIA 5, 1,5 u per podoloog in het eigen centrum, door Dobbels, van 15 tot 26 maart, na SEBIA 3 en 4 (A) of vanaf 12 april (B), bij voorkeur vóór de eerste maand 3-visite (beste moment: Kortrijk wo, Brugge ma VM, Antwerpen di of wo VM, Aalst di; Gent en Leuven nog op te vragen). SEBIA 6, intervisie met feedback, 1 u per podoloog, online, door Dobbels, op maand 6–9 na de start, september tot november 2027 bij een start eind februari.</w:t>
+        <w:t>SEBIA 6, intervisie met feedback, 1 u per podoloog, online, door Dobbels, op maand 6–9 na de start, september tot november 2027 bij een start eind februari.</w:t>
       </w:r>
     </w:p>
     <w:p>
@@ -5511,7 +6578,7 @@
           <w:color w:val="FF7A00"/>
           <w:sz w:val="22"/>
         </w:rPr>
-        <w:t xml:space="preserve">6  </w:t>
+        <w:t xml:space="preserve">7  </w:t>
       </w:r>
       <w:r>
         <w:rPr>
@@ -5707,7 +6774,7 @@
                 <w:color w:val="FFFFFF"/>
                 <w:sz w:val="15"/>
               </w:rPr>
-              <w:t>SEBIA 5 · beste moment</w:t>
+              <w:t>SEBIA 5 · voorstel</w:t>
             </w:r>
           </w:p>
         </w:tc>
@@ -5853,7 +6920,7 @@
                 <w:color w:val="1B2630"/>
                 <w:sz w:val="16"/>
               </w:rPr>
-              <w:t>A: wo 10 mrt NM · B: wo 24 mrt NM, met Brugge</w:t>
+              <w:t>ma 1 mrt NM, met Brugge (1e)</w:t>
             </w:r>
           </w:p>
         </w:tc>
@@ -5873,7 +6940,7 @@
                 <w:color w:val="1B2630"/>
                 <w:sz w:val="16"/>
               </w:rPr>
-              <w:t>woensdag</w:t>
+              <w:t>di 20 apr, VM</w:t>
             </w:r>
           </w:p>
         </w:tc>
@@ -6018,7 +7085,7 @@
                 <w:color w:val="1B2630"/>
                 <w:sz w:val="16"/>
               </w:rPr>
-              <w:t>1e: wo 10 mrt NM (B: wo 24 mrt) · 2e: di 9 mrt NM (B: di 23 mrt)</w:t>
+              <w:t>1e: ma 1 mrt NM, met Kortrijk · 2e: di 2 mrt NM, met Oost</w:t>
             </w:r>
           </w:p>
         </w:tc>
@@ -6038,7 +7105,7 @@
                 <w:color w:val="1B2630"/>
                 <w:sz w:val="16"/>
               </w:rPr>
-              <w:t>maandag VM</w:t>
+              <w:t>ma 26 apr, VM</w:t>
             </w:r>
           </w:p>
         </w:tc>
@@ -6183,7 +7250,7 @@
                 <w:color w:val="1B2630"/>
                 <w:sz w:val="16"/>
               </w:rPr>
-              <w:t>A: vr 12 mrt NM · B: vr 26 mrt NM, in UZ Gent</w:t>
+              <w:t>vr 5 mrt NM, in UZ Gent</w:t>
             </w:r>
           </w:p>
         </w:tc>
@@ -6203,7 +7270,7 @@
                 <w:color w:val="1B2630"/>
                 <w:sz w:val="16"/>
               </w:rPr>
-              <w:t>nog op te vragen</w:t>
+              <w:t>vr 23 apr, NM</w:t>
             </w:r>
           </w:p>
         </w:tc>
@@ -6348,7 +7415,7 @@
                 <w:color w:val="1B2630"/>
                 <w:sz w:val="16"/>
               </w:rPr>
-              <w:t>Oost · A: di 9 mrt · B: di 23 mrt</w:t>
+              <w:t>Oost · di 2 mrt NM</w:t>
             </w:r>
           </w:p>
         </w:tc>
@@ -6368,7 +7435,7 @@
                 <w:color w:val="1B2630"/>
                 <w:sz w:val="16"/>
               </w:rPr>
-              <w:t>dinsdag</w:t>
+              <w:t>di 20 apr, NM</w:t>
             </w:r>
           </w:p>
         </w:tc>
@@ -6513,7 +7580,7 @@
                 <w:color w:val="1B2630"/>
                 <w:sz w:val="16"/>
               </w:rPr>
-              <w:t>Oost · A: di 9 mrt · B: di 23 mrt</w:t>
+              <w:t>Oost · di 2 mrt NM</w:t>
             </w:r>
           </w:p>
         </w:tc>
@@ -6533,7 +7600,7 @@
                 <w:color w:val="1B2630"/>
                 <w:sz w:val="16"/>
               </w:rPr>
-              <w:t>nog op te vragen</w:t>
+              <w:t>vr 30 apr, VM</w:t>
             </w:r>
           </w:p>
         </w:tc>
@@ -6678,7 +7745,7 @@
                 <w:color w:val="1B2630"/>
                 <w:sz w:val="16"/>
               </w:rPr>
-              <w:t>Oost · A: di 9 mrt · B: di 23 mrt</w:t>
+              <w:t>Oost · di 2 mrt NM</w:t>
             </w:r>
           </w:p>
         </w:tc>
@@ -6698,7 +7765,7 @@
                 <w:color w:val="1B2630"/>
                 <w:sz w:val="16"/>
               </w:rPr>
-              <w:t>di of wo VM</w:t>
+              <w:t>di 27 apr, VM</w:t>
             </w:r>
           </w:p>
         </w:tc>
@@ -6768,7 +7835,7 @@
           <w:color w:val="1B2630"/>
           <w:sz w:val="17"/>
         </w:rPr>
-        <w:t>Waar het niet voor iedereen lukt, zijn er twee opties (A en B): planning, sectie 9. Toetsing bij de centra tegen vr 16 okt.</w:t>
+        <w:t>Waar het niet voor iedereen lukt, zijn er twee opties (A en B): planning, sectie 9. De centra antwoorden met de fiche van hun opleidingsdocument, tegen vr 16 okt.</w:t>
       </w:r>
     </w:p>
     <w:p>
@@ -6872,7 +7939,33 @@
           <w:color w:val="1B2630"/>
           <w:sz w:val="17"/>
         </w:rPr>
-        <w:t>SEBIA 1–4 volgt de agenda van Dobbels; na januari nog te bevestigen. Locaties: voorstel Leuven voor groep Oost, Kortrijk of Brugge, en UZ Gent.</w:t>
+        <w:t>SEBIA volgt de agenda van Dobbels: SEBIA 3–4 op de data die ze op 6 oktober aanbood, SEBIA 5 tussen 20 en 30 april; de dagen nog bij haar te bevestigen. Locaties: voorstel Leuven voor groep Oost, Kortrijk of Brugge, en UZ Gent.</w:t>
+      </w:r>
+    </w:p>
+    <w:p>
+      <w:pPr>
+        <w:spacing w:before="0" w:after="20"/>
+        <w:ind w:left="200" w:hanging="200"/>
+      </w:pPr>
+      <w:r>
+        <w:rPr>
+          <w:rFonts w:ascii="Segoe UI" w:hAnsi="Segoe UI"/>
+          <w:b/>
+          <w:i w:val="0"/>
+          <w:color w:val="FF7A00"/>
+          <w:sz w:val="17"/>
+        </w:rPr>
+        <w:t xml:space="preserve">–  </w:t>
+      </w:r>
+      <w:r>
+        <w:rPr>
+          <w:rFonts w:ascii="Segoe UI" w:hAnsi="Segoe UI"/>
+          <w:b w:val="0"/>
+          <w:i w:val="0"/>
+          <w:color w:val="1B2630"/>
+          <w:sz w:val="17"/>
+        </w:rPr>
+        <w:t>Inhaal SEBIA: voor SEBIA 1–2 is er geen; dat van SEBIA 3–4 (ma 8 mrt) past op maandag alleen voor Kortrijk en mogelijk Brugge. Zie planning, Te beslissen.</w:t>
       </w:r>
     </w:p>
     <w:sectPr>

</xml_diff>

<commit_message>
Opleidingsplanning en kalender: drie pedorthisten (Vigo, Eqwal, Orthovano) in plaats van twee
Co-Authored-By: Claude Opus 5.5 <noreply@anthropic.com>
</commit_message>
<xml_diff>
--- a/Educatie/PARADISE_kalender_opleiding.docx
+++ b/Educatie/PARADISE_kalender_opleiding.docx
@@ -6603,7 +6603,7 @@
           <w:color w:val="5A6A78"/>
           <w:sz w:val="17"/>
         </w:rPr>
-        <w:t>Technologie en droogloop ter plaatse; SEBIA 1–4 in drie groepen, voor Gent in UZ Gent; SEBIA 5 in het eigen centrum. De online sessies staan in de maandrasters. De technologie begint met theorie, waar de artsen kunnen aansluiten en de twee pedorthisten elk één keer komen, bij een van hun centra.</w:t>
+        <w:t>Technologie en droogloop ter plaatse; SEBIA 1–4 in drie groepen, voor Gent in UZ Gent; SEBIA 5 in het eigen centrum. De online sessies staan in de maandrasters. De technologie begint met theorie, waar de artsen kunnen aansluiten en de drie pedorthisten elk één keer komen, bij een van hun centra.</w:t>
       </w:r>
     </w:p>
     <w:tbl>
@@ -7913,7 +7913,7 @@
           <w:color w:val="1B2630"/>
           <w:sz w:val="17"/>
         </w:rPr>
-        <w:t>Bij welke technologiesessie elk van de twee pedorthisten aanwezig is.</w:t>
+        <w:t>Bij welke technologiesessie elk van de drie pedorthisten aanwezig is.</w:t>
       </w:r>
     </w:p>
     <w:p>

</xml_diff>

<commit_message>
Opleiding Kortrijk (mail Louise Verhelst 20/10): technologie wo 2 dec VM, inhaal droogloop ma 25 jan VM
Co-Authored-By: Claude Opus 5.5 <noreply@anthropic.com>
</commit_message>
<xml_diff>
--- a/Educatie/PARADISE_kalender_opleiding.docx
+++ b/Educatie/PARADISE_kalender_opleiding.docx
@@ -1144,7 +1144,7 @@
           <w:color w:val="1B2630"/>
           <w:sz w:val="16"/>
         </w:rPr>
-        <w:t>ma 30 nov: technologie Brugge VM en Kortrijk NM, in plaats van wo 2 dec.</w:t>
+        <w:t>ma 30 nov: technologie Brugge VM, in plaats van wo 2 dec NM.</w:t>
       </w:r>
     </w:p>
     <w:p>
@@ -3444,7 +3444,7 @@
                 <w:color w:val="5A6A78"/>
                 <w:sz w:val="15"/>
               </w:rPr>
-              <w:t xml:space="preserve">NM  </w:t>
+              <w:t>VM  Inhaalslot · Kortrijk</w:t>
             </w:r>
             <w:r>
               <w:rPr>
@@ -3454,7 +3454,6 @@
                 <w:color w:val="5A6A78"/>
                 <w:sz w:val="15"/>
               </w:rPr>
-              <w:t>Inhaalslot</w:t>
             </w:r>
             <w:r>
               <w:rPr>
@@ -3464,7 +3463,6 @@
                 <w:color w:val="1B2630"/>
                 <w:sz w:val="15"/>
               </w:rPr>
-              <w:t xml:space="preserve"> · Kortrijk</w:t>
             </w:r>
           </w:p>
         </w:tc>
@@ -6840,7 +6838,7 @@
                 <w:color w:val="1B2630"/>
                 <w:sz w:val="16"/>
               </w:rPr>
-              <w:t>A: wo 2 dec VM · B: ma 30 nov NM</w:t>
+              <w:t>wo 2 dec VM</w:t>
             </w:r>
           </w:p>
         </w:tc>
@@ -6900,7 +6898,7 @@
                 <w:color w:val="1B2630"/>
                 <w:sz w:val="16"/>
               </w:rPr>
-              <w:t>ma 25 jan, NM</w:t>
+              <w:t>ma 25 jan, VM</w:t>
             </w:r>
           </w:p>
         </w:tc>

</xml_diff>

<commit_message>
Opleiding: fiches Kortrijk, Brugge, Leuven en Antwerpen verwerkt (mails t.e.m. 25/10)
Kortrijk SEBIA 1-2 wo 16 dec, droogloop ma 25 jan (wo 20 jan past niet); Brugge technologie ma 30 nov en droogloop ma 18 jan, SEBIA 1-2 nog te bepalen (geen woensdag); Antwerpen technologie naar januari; Leuven bevestigd; open punten en inhaalslots bijgewerkt.

Co-Authored-By: Claude Opus 5.5 <noreply@anthropic.com>
</commit_message>
<xml_diff>
--- a/Educatie/PARADISE_kalender_opleiding.docx
+++ b/Educatie/PARADISE_kalender_opleiding.docx
@@ -44,7 +44,7 @@
           <w:color w:val="5A6A78"/>
           <w:sz w:val="17"/>
         </w:rPr>
-        <w:t>November 2026 tot april 2027, volgens de opleidingsplanning van 8 oktober 2026. VM = voormiddag, NM = namiddag. Waar het niet voor iedereen lukt, staat in het rooster optie A, het voorstel; optie B staat onder de maand. Beide worden getoetst bij de centra tegen vr 16 okt. Artsen volgen alleen theorie en kunnen aansluiten bij het theoriedeel van de technologie; de praktijk en de droogloop zijn voor de podologen.</w:t>
+        <w:t>November 2026 tot april 2027, volgens de opleidingsplanning van 25 oktober 2026, met de teruggestuurde fiches. VM = voormiddag, NM = namiddag. Waar een centrum nog moet kiezen (Gent, SEBIA 1–2), staat optie A in het rooster en optie B onder de maand. Artsen volgen alleen theorie en kunnen aansluiten bij het theoriedeel van de technologie; de praktijk en de droogloop zijn voor de podologen.</w:t>
       </w:r>
     </w:p>
     <w:tbl>
@@ -1063,6 +1063,7 @@
         <w:tc>
           <w:tcPr>
             <w:tcW w:type="dxa" w:w="2835"/>
+            <w:shd w:val="clear" w:color="auto" w:fill="DDF1F8"/>
           </w:tcPr>
           <w:p>
             <w:pPr>
@@ -1077,6 +1078,41 @@
                 <w:sz w:val="15"/>
               </w:rPr>
               <w:t>30</w:t>
+            </w:r>
+          </w:p>
+          <w:p>
+            <w:pPr>
+              <w:spacing w:before="20" w:after="20"/>
+            </w:pPr>
+            <w:r>
+              <w:rPr>
+                <w:rFonts w:ascii="Segoe UI" w:hAnsi="Segoe UI"/>
+                <w:b/>
+                <w:i w:val="0"/>
+                <w:color w:val="00407A"/>
+                <w:sz w:val="15"/>
+              </w:rPr>
+              <w:t xml:space="preserve">VM  </w:t>
+            </w:r>
+            <w:r>
+              <w:rPr>
+                <w:rFonts w:ascii="Segoe UI" w:hAnsi="Segoe UI"/>
+                <w:b/>
+                <w:i w:val="0"/>
+                <w:color w:val="00407A"/>
+                <w:sz w:val="15"/>
+              </w:rPr>
+              <w:t>Technologie</w:t>
+            </w:r>
+            <w:r>
+              <w:rPr>
+                <w:rFonts w:ascii="Segoe UI" w:hAnsi="Segoe UI"/>
+                <w:b w:val="0"/>
+                <w:i w:val="0"/>
+                <w:color w:val="1B2630"/>
+                <w:sz w:val="15"/>
+              </w:rPr>
+              <w:t xml:space="preserve"> · AZ Sint-Jan Brugge</w:t>
             </w:r>
           </w:p>
         </w:tc>
@@ -1134,7 +1170,7 @@
           <w:color w:val="00407A"/>
           <w:sz w:val="16"/>
         </w:rPr>
-        <w:t xml:space="preserve">Optie B, als optie A niet lukt: </w:t>
+        <w:t xml:space="preserve">Gekozen: </w:t>
       </w:r>
       <w:r>
         <w:rPr>
@@ -1144,7 +1180,7 @@
           <w:color w:val="1B2630"/>
           <w:sz w:val="16"/>
         </w:rPr>
-        <w:t>ma 30 nov: technologie Brugge VM, in plaats van wo 2 dec NM.</w:t>
+        <w:t>technologie Brugge op ma 30 nov VM (optie B, fiche 21 okt).</w:t>
       </w:r>
     </w:p>
     <w:p>
@@ -1439,41 +1475,6 @@
               <w:t xml:space="preserve"> · AZ Groeninge Kortrijk</w:t>
             </w:r>
           </w:p>
-          <w:p>
-            <w:pPr>
-              <w:spacing w:before="20" w:after="20"/>
-            </w:pPr>
-            <w:r>
-              <w:rPr>
-                <w:rFonts w:ascii="Segoe UI" w:hAnsi="Segoe UI"/>
-                <w:b/>
-                <w:i w:val="0"/>
-                <w:color w:val="00407A"/>
-                <w:sz w:val="15"/>
-              </w:rPr>
-              <w:t xml:space="preserve">NM  </w:t>
-            </w:r>
-            <w:r>
-              <w:rPr>
-                <w:rFonts w:ascii="Segoe UI" w:hAnsi="Segoe UI"/>
-                <w:b/>
-                <w:i w:val="0"/>
-                <w:color w:val="00407A"/>
-                <w:sz w:val="15"/>
-              </w:rPr>
-              <w:t>Technologie</w:t>
-            </w:r>
-            <w:r>
-              <w:rPr>
-                <w:rFonts w:ascii="Segoe UI" w:hAnsi="Segoe UI"/>
-                <w:b w:val="0"/>
-                <w:i w:val="0"/>
-                <w:color w:val="1B2630"/>
-                <w:sz w:val="15"/>
-              </w:rPr>
-              <w:t xml:space="preserve"> · AZ Sint-Jan Brugge</w:t>
-            </w:r>
-          </w:p>
         </w:tc>
         <w:tc>
           <w:tcPr>
@@ -1619,7 +1620,6 @@
         <w:tc>
           <w:tcPr>
             <w:tcW w:type="dxa" w:w="2835"/>
-            <w:shd w:val="clear" w:color="auto" w:fill="DDF1F8"/>
           </w:tcPr>
           <w:p>
             <w:pPr>
@@ -1634,41 +1634,6 @@
                 <w:sz w:val="15"/>
               </w:rPr>
               <w:t>9</w:t>
-            </w:r>
-          </w:p>
-          <w:p>
-            <w:pPr>
-              <w:spacing w:before="20" w:after="20"/>
-            </w:pPr>
-            <w:r>
-              <w:rPr>
-                <w:rFonts w:ascii="Segoe UI" w:hAnsi="Segoe UI"/>
-                <w:b/>
-                <w:i w:val="0"/>
-                <w:color w:val="00407A"/>
-                <w:sz w:val="15"/>
-              </w:rPr>
-              <w:t xml:space="preserve">VM  </w:t>
-            </w:r>
-            <w:r>
-              <w:rPr>
-                <w:rFonts w:ascii="Segoe UI" w:hAnsi="Segoe UI"/>
-                <w:b/>
-                <w:i w:val="0"/>
-                <w:color w:val="00407A"/>
-                <w:sz w:val="15"/>
-              </w:rPr>
-              <w:t>Technologie</w:t>
-            </w:r>
-            <w:r>
-              <w:rPr>
-                <w:rFonts w:ascii="Segoe UI" w:hAnsi="Segoe UI"/>
-                <w:b w:val="0"/>
-                <w:i w:val="0"/>
-                <w:color w:val="1B2630"/>
-                <w:sz w:val="15"/>
-              </w:rPr>
-              <w:t xml:space="preserve"> · UZ Antwerpen</w:t>
             </w:r>
           </w:p>
         </w:tc>
@@ -1887,6 +1852,7 @@
         <w:tc>
           <w:tcPr>
             <w:tcW w:type="dxa" w:w="2835"/>
+            <w:shd w:val="clear" w:color="auto" w:fill="FFE9D6"/>
           </w:tcPr>
           <w:p>
             <w:pPr>
@@ -1901,6 +1867,41 @@
                 <w:sz w:val="15"/>
               </w:rPr>
               <w:t>16</w:t>
+            </w:r>
+          </w:p>
+          <w:p>
+            <w:pPr>
+              <w:spacing w:before="20" w:after="20"/>
+            </w:pPr>
+            <w:r>
+              <w:rPr>
+                <w:rFonts w:ascii="Segoe UI" w:hAnsi="Segoe UI"/>
+                <w:b/>
+                <w:i w:val="0"/>
+                <w:color w:val="A34A00"/>
+                <w:sz w:val="15"/>
+              </w:rPr>
+              <w:t xml:space="preserve">13u–17u  </w:t>
+            </w:r>
+            <w:r>
+              <w:rPr>
+                <w:rFonts w:ascii="Segoe UI" w:hAnsi="Segoe UI"/>
+                <w:b/>
+                <w:i w:val="0"/>
+                <w:color w:val="A34A00"/>
+                <w:sz w:val="15"/>
+              </w:rPr>
+              <w:t>SEBIA 1–2</w:t>
+            </w:r>
+            <w:r>
+              <w:rPr>
+                <w:rFonts w:ascii="Segoe UI" w:hAnsi="Segoe UI"/>
+                <w:b w:val="0"/>
+                <w:i w:val="0"/>
+                <w:color w:val="1B2630"/>
+                <w:sz w:val="15"/>
+              </w:rPr>
+              <w:t>, Kortrijk · voorstel AZ Groeninge Kortrijk</w:t>
             </w:r>
           </w:p>
         </w:tc>
@@ -2689,7 +2690,6 @@
         <w:tc>
           <w:tcPr>
             <w:tcW w:type="dxa" w:w="2835"/>
-            <w:shd w:val="clear" w:color="auto" w:fill="FFE9D6"/>
           </w:tcPr>
           <w:p>
             <w:pPr>
@@ -2704,41 +2704,6 @@
                 <w:sz w:val="15"/>
               </w:rPr>
               <w:t>6</w:t>
-            </w:r>
-          </w:p>
-          <w:p>
-            <w:pPr>
-              <w:spacing w:before="20" w:after="20"/>
-            </w:pPr>
-            <w:r>
-              <w:rPr>
-                <w:rFonts w:ascii="Segoe UI" w:hAnsi="Segoe UI"/>
-                <w:b/>
-                <w:i w:val="0"/>
-                <w:color w:val="A34A00"/>
-                <w:sz w:val="15"/>
-              </w:rPr>
-              <w:t xml:space="preserve">13u–17u  </w:t>
-            </w:r>
-            <w:r>
-              <w:rPr>
-                <w:rFonts w:ascii="Segoe UI" w:hAnsi="Segoe UI"/>
-                <w:b/>
-                <w:i w:val="0"/>
-                <w:color w:val="A34A00"/>
-                <w:sz w:val="15"/>
-              </w:rPr>
-              <w:t>SEBIA 1–2, Kortrijk en Brugge (1e podoloog)</w:t>
-            </w:r>
-            <w:r>
-              <w:rPr>
-                <w:rFonts w:ascii="Segoe UI" w:hAnsi="Segoe UI"/>
-                <w:b w:val="0"/>
-                <w:i w:val="0"/>
-                <w:color w:val="1B2630"/>
-                <w:sz w:val="15"/>
-              </w:rPr>
-              <w:t xml:space="preserve"> · voorstel Kortrijk of Brugge</w:t>
             </w:r>
           </w:p>
         </w:tc>
@@ -2931,7 +2896,7 @@
                 <w:color w:val="A34A00"/>
                 <w:sz w:val="15"/>
               </w:rPr>
-              <w:t>SEBIA 1–2, groep Oost en Brugge (2e podoloog)</w:t>
+              <w:t>SEBIA 1–2, groep Oost</w:t>
             </w:r>
             <w:r>
               <w:rPr>
@@ -2948,7 +2913,6 @@
         <w:tc>
           <w:tcPr>
             <w:tcW w:type="dxa" w:w="2835"/>
-            <w:shd w:val="clear" w:color="auto" w:fill="E6F0E9"/>
           </w:tcPr>
           <w:p>
             <w:pPr>
@@ -2963,41 +2927,6 @@
                 <w:sz w:val="15"/>
               </w:rPr>
               <w:t>13</w:t>
-            </w:r>
-          </w:p>
-          <w:p>
-            <w:pPr>
-              <w:spacing w:before="20" w:after="20"/>
-            </w:pPr>
-            <w:r>
-              <w:rPr>
-                <w:rFonts w:ascii="Segoe UI" w:hAnsi="Segoe UI"/>
-                <w:b/>
-                <w:i w:val="0"/>
-                <w:color w:val="1E5B3A"/>
-                <w:sz w:val="15"/>
-              </w:rPr>
-              <w:t xml:space="preserve">NM  </w:t>
-            </w:r>
-            <w:r>
-              <w:rPr>
-                <w:rFonts w:ascii="Segoe UI" w:hAnsi="Segoe UI"/>
-                <w:b/>
-                <w:i w:val="0"/>
-                <w:color w:val="1E5B3A"/>
-                <w:sz w:val="15"/>
-              </w:rPr>
-              <w:t>Droogloop</w:t>
-            </w:r>
-            <w:r>
-              <w:rPr>
-                <w:rFonts w:ascii="Segoe UI" w:hAnsi="Segoe UI"/>
-                <w:b w:val="0"/>
-                <w:i w:val="0"/>
-                <w:color w:val="1B2630"/>
-                <w:sz w:val="15"/>
-              </w:rPr>
-              <w:t xml:space="preserve"> · AZ Sint-Jan Brugge</w:t>
             </w:r>
           </w:p>
         </w:tc>
@@ -3105,7 +3034,7 @@
         <w:tc>
           <w:tcPr>
             <w:tcW w:type="dxa" w:w="2835"/>
-            <w:shd w:val="clear" w:color="auto" w:fill="FFFFFF"/>
+            <w:shd w:val="clear" w:color="auto" w:fill="E6F0E9"/>
           </w:tcPr>
           <w:p>
             <w:pPr>
@@ -3131,7 +3060,7 @@
                 <w:rFonts w:ascii="Segoe UI" w:hAnsi="Segoe UI"/>
                 <w:b/>
                 <w:i w:val="0"/>
-                <w:color w:val="5A6A78"/>
+                <w:color w:val="1E5B3A"/>
                 <w:sz w:val="15"/>
               </w:rPr>
               <w:t xml:space="preserve">VM  </w:t>
@@ -3140,21 +3069,21 @@
               <w:rPr>
                 <w:rFonts w:ascii="Segoe UI" w:hAnsi="Segoe UI"/>
                 <w:b/>
-                <w:i/>
-                <w:color w:val="5A6A78"/>
-                <w:sz w:val="15"/>
-              </w:rPr>
-              <w:t>Inhaalslot</w:t>
+                <w:i w:val="0"/>
+                <w:color w:val="1E5B3A"/>
+                <w:sz w:val="15"/>
+              </w:rPr>
+              <w:t>Droogloop</w:t>
             </w:r>
             <w:r>
               <w:rPr>
                 <w:rFonts w:ascii="Segoe UI" w:hAnsi="Segoe UI"/>
                 <w:b w:val="0"/>
-                <w:i/>
+                <w:i w:val="0"/>
                 <w:color w:val="1B2630"/>
                 <w:sz w:val="15"/>
               </w:rPr>
-              <w:t xml:space="preserve"> · Brugge</w:t>
+              <w:t xml:space="preserve"> · AZ Sint-Jan Brugge</w:t>
             </w:r>
           </w:p>
         </w:tc>
@@ -3207,7 +3136,6 @@
         <w:tc>
           <w:tcPr>
             <w:tcW w:type="dxa" w:w="2835"/>
-            <w:shd w:val="clear" w:color="auto" w:fill="E6F0E9"/>
           </w:tcPr>
           <w:p>
             <w:pPr>
@@ -3222,31 +3150,6 @@
                 <w:sz w:val="15"/>
               </w:rPr>
               <w:t>20</w:t>
-            </w:r>
-          </w:p>
-          <w:p>
-            <w:pPr>
-              <w:spacing w:before="20" w:after="20"/>
-            </w:pPr>
-            <w:r>
-              <w:rPr>
-                <w:rFonts w:ascii="Segoe UI" w:hAnsi="Segoe UI"/>
-                <w:b/>
-                <w:i w:val="0"/>
-                <w:color w:val="1E5B3A"/>
-                <w:sz w:val="15"/>
-              </w:rPr>
-              <w:t>Droogloop</w:t>
-            </w:r>
-            <w:r>
-              <w:rPr>
-                <w:rFonts w:ascii="Segoe UI" w:hAnsi="Segoe UI"/>
-                <w:b w:val="0"/>
-                <w:i w:val="0"/>
-                <w:color w:val="1B2630"/>
-                <w:sz w:val="15"/>
-              </w:rPr>
-              <w:t xml:space="preserve"> · AZ Groeninge Kortrijk</w:t>
             </w:r>
           </w:p>
         </w:tc>
@@ -3415,7 +3318,7 @@
         <w:tc>
           <w:tcPr>
             <w:tcW w:type="dxa" w:w="2835"/>
-            <w:shd w:val="clear" w:color="auto" w:fill="FFFFFF"/>
+            <w:shd w:val="clear" w:color="auto" w:fill="E6F0E9"/>
           </w:tcPr>
           <w:p>
             <w:pPr>
@@ -3441,28 +3344,30 @@
                 <w:rFonts w:ascii="Segoe UI" w:hAnsi="Segoe UI"/>
                 <w:b/>
                 <w:i w:val="0"/>
-                <w:color w:val="5A6A78"/>
-                <w:sz w:val="15"/>
-              </w:rPr>
-              <w:t>VM  Inhaalslot · Kortrijk</w:t>
+                <w:color w:val="1E5B3A"/>
+                <w:sz w:val="15"/>
+              </w:rPr>
+              <w:t xml:space="preserve">VM  </w:t>
             </w:r>
             <w:r>
               <w:rPr>
                 <w:rFonts w:ascii="Segoe UI" w:hAnsi="Segoe UI"/>
                 <w:b/>
-                <w:i/>
-                <w:color w:val="5A6A78"/>
-                <w:sz w:val="15"/>
-              </w:rPr>
+                <w:i w:val="0"/>
+                <w:color w:val="1E5B3A"/>
+                <w:sz w:val="15"/>
+              </w:rPr>
+              <w:t>Droogloop</w:t>
             </w:r>
             <w:r>
               <w:rPr>
                 <w:rFonts w:ascii="Segoe UI" w:hAnsi="Segoe UI"/>
                 <w:b w:val="0"/>
-                <w:i/>
+                <w:i w:val="0"/>
                 <w:color w:val="1B2630"/>
                 <w:sz w:val="15"/>
               </w:rPr>
+              <w:t xml:space="preserve"> · AZ Groeninge Kortrijk</w:t>
             </w:r>
           </w:p>
         </w:tc>
@@ -3610,7 +3515,7 @@
                 <w:color w:val="1B2630"/>
                 <w:sz w:val="15"/>
               </w:rPr>
-              <w:t xml:space="preserve"> · Antwerpen (VM), Gent (VM)</w:t>
+              <w:t xml:space="preserve"> · Gent (VM)</w:t>
             </w:r>
           </w:p>
         </w:tc>
@@ -3648,7 +3553,7 @@
           <w:color w:val="00407A"/>
           <w:sz w:val="16"/>
         </w:rPr>
-        <w:t xml:space="preserve">Optie B, als optie A niet lukt: </w:t>
+        <w:t xml:space="preserve">Gekozen en open: </w:t>
       </w:r>
       <w:r>
         <w:rPr>
@@ -3658,7 +3563,7 @@
           <w:color w:val="1B2630"/>
           <w:sz w:val="16"/>
         </w:rPr>
-        <w:t>wo 16 dec, 13u–17u: SEBIA 1–2 voor Kortrijk en Brugge, in plaats van wo 6 jan. vr 11 dec, 13u–17u: SEBIA 1–2 voor Gent, in plaats van vr 15 jan. ma 18 jan VM: droogloop Brugge, in plaats van wo 13 jan; dan wordt wo 13 jan NM het inhaalslot.</w:t>
+        <w:t>SEBIA 1–2 voor Kortrijk op wo 16 dec (optie B). Droogloop Brugge op ma 18 jan VM (optie B); het inhaalslot wo 13 jan vervalt, want op woensdag kan Sint-Jan niet. Droogloop Kortrijk op ma 25 jan VM, want wo 20 jan past niet. Antwerpen kan op do 28 jan niet inhalen. Gent kiest nog voor SEBIA 1–2: vr 15 jan, of vr 11 dec 13u–17u. Nog zonder datum: technologie UZ Antwerpen (in januari, vóór de droogloop van 27 jan) en SEBIA 1–2 voor Brugge.</w:t>
       </w:r>
     </w:p>
     <w:p>
@@ -4735,7 +4640,7 @@
                 <w:color w:val="A34A00"/>
                 <w:sz w:val="15"/>
               </w:rPr>
-              <w:t>SEBIA 3–4, Kortrijk en Brugge (1e podoloog)</w:t>
+              <w:t>SEBIA 3–4, Kortrijk en Brugge</w:t>
             </w:r>
             <w:r>
               <w:rPr>
@@ -4791,7 +4696,7 @@
                 <w:color w:val="A34A00"/>
                 <w:sz w:val="15"/>
               </w:rPr>
-              <w:t>SEBIA 3–4, groep Oost en Brugge (2e podoloog)</w:t>
+              <w:t>SEBIA 3–4, groep Oost</w:t>
             </w:r>
             <w:r>
               <w:rPr>
@@ -6858,7 +6763,7 @@
                 <w:color w:val="1B2630"/>
                 <w:sz w:val="16"/>
               </w:rPr>
-              <w:t>A: wo 6 jan NM · B: wo 16 dec NM, met Brugge</w:t>
+              <w:t>wo 16 dec NM</w:t>
             </w:r>
           </w:p>
         </w:tc>
@@ -6878,7 +6783,7 @@
                 <w:color w:val="1B2630"/>
                 <w:sz w:val="16"/>
               </w:rPr>
-              <w:t>wo 20 jan</w:t>
+              <w:t>ma 25 jan, VM (wo 20 jan past niet)</w:t>
             </w:r>
           </w:p>
         </w:tc>
@@ -6898,7 +6803,7 @@
                 <w:color w:val="1B2630"/>
                 <w:sz w:val="16"/>
               </w:rPr>
-              <w:t>ma 25 jan, VM</w:t>
+              <w:t>nog te zoeken</w:t>
             </w:r>
           </w:p>
         </w:tc>
@@ -6918,7 +6823,7 @@
                 <w:color w:val="1B2630"/>
                 <w:sz w:val="16"/>
               </w:rPr>
-              <w:t>ma 1 mrt NM, met Brugge (1e)</w:t>
+              <w:t>ma 1 mrt NM, met Brugge</w:t>
             </w:r>
           </w:p>
         </w:tc>
@@ -7003,7 +6908,7 @@
                 <w:color w:val="1B2630"/>
                 <w:sz w:val="16"/>
               </w:rPr>
-              <w:t>A: wo 2 dec NM · B: ma 30 nov VM</w:t>
+              <w:t>ma 30 nov VM</w:t>
             </w:r>
           </w:p>
         </w:tc>
@@ -7023,7 +6928,7 @@
                 <w:color w:val="1B2630"/>
                 <w:sz w:val="16"/>
               </w:rPr>
-              <w:t>1e: wo 6 jan NM (B: wo 16 dec) · 2e: di 12 jan NM, met Oost</w:t>
+              <w:t>nog te bepalen: geen woensdag, di 12 jan past niet</w:t>
             </w:r>
           </w:p>
         </w:tc>
@@ -7043,7 +6948,7 @@
                 <w:color w:val="1B2630"/>
                 <w:sz w:val="16"/>
               </w:rPr>
-              <w:t>A: wo 13 jan NM · B: ma 18 jan VM</w:t>
+              <w:t>ma 18 jan VM</w:t>
             </w:r>
           </w:p>
         </w:tc>
@@ -7063,7 +6968,7 @@
                 <w:color w:val="1B2630"/>
                 <w:sz w:val="16"/>
               </w:rPr>
-              <w:t>de niet gekozen droogloopdatum: ma 18 jan VM bij optie A</w:t>
+              <w:t>nog te zoeken (wo 13 jan kan niet)</w:t>
             </w:r>
           </w:p>
         </w:tc>
@@ -7083,7 +6988,7 @@
                 <w:color w:val="1B2630"/>
                 <w:sz w:val="16"/>
               </w:rPr>
-              <w:t>1e: ma 1 mrt NM, met Kortrijk · 2e: di 2 mrt NM, met Oost</w:t>
+              <w:t>ma 1 mrt NM, met Kortrijk; di 2 mrt past niet</w:t>
             </w:r>
           </w:p>
         </w:tc>
@@ -7123,7 +7028,7 @@
                 <w:color w:val="1B2630"/>
                 <w:sz w:val="16"/>
               </w:rPr>
-              <w:t>wo (1e), di NM en wo VM (2e) · voetkliniek wo VM</w:t>
+              <w:t>maandag is studiedag; geen woensdag voor opleiding · voetkliniek wo VM</w:t>
             </w:r>
           </w:p>
         </w:tc>
@@ -7663,7 +7568,7 @@
                 <w:color w:val="1B2630"/>
                 <w:sz w:val="16"/>
               </w:rPr>
-              <w:t>wo 9 dec, VM</w:t>
+              <w:t>januari, datum af te spreken</w:t>
             </w:r>
           </w:p>
         </w:tc>
@@ -7683,7 +7588,7 @@
                 <w:color w:val="1B2630"/>
                 <w:sz w:val="16"/>
               </w:rPr>
-              <w:t>Oost: di 12 jan, 13u–17u</w:t>
+              <w:t>Oost: di 12 jan, 13u–17u; vraagt UZA of online</w:t>
             </w:r>
           </w:p>
         </w:tc>
@@ -7723,7 +7628,7 @@
                 <w:color w:val="1B2630"/>
                 <w:sz w:val="16"/>
               </w:rPr>
-              <w:t>do 28 jan, VM</w:t>
+              <w:t>nog te zoeken (do 28 jan past niet)</w:t>
             </w:r>
           </w:p>
         </w:tc>
@@ -7783,7 +7688,7 @@
                 <w:color w:val="1B2630"/>
                 <w:sz w:val="16"/>
               </w:rPr>
-              <w:t>di, wo; do alleen in even weken · voetkliniek wo NM en do NM</w:t>
+              <w:t>di, wo; do alleen in even weken · voetkliniek wo NM en do NM · podoloog terug in januari 2027</w:t>
             </w:r>
           </w:p>
         </w:tc>
@@ -7833,7 +7738,33 @@
           <w:color w:val="1B2630"/>
           <w:sz w:val="17"/>
         </w:rPr>
-        <w:t>Waar het niet voor iedereen lukt, zijn er twee opties (A en B): planning, sectie 9. De centra antwoorden met de fiche van hun opleidingsdocument, tegen vr 16 okt.</w:t>
+        <w:t>Fiches terug van Kortrijk, Brugge en Leuven; Antwerpen vulde alleen de technologie in, Gent bevestigt di 27 okt en Aalst na een intern overleg op ma 2 nov.</w:t>
+      </w:r>
+    </w:p>
+    <w:p>
+      <w:pPr>
+        <w:spacing w:before="0" w:after="20"/>
+        <w:ind w:left="200" w:hanging="200"/>
+      </w:pPr>
+      <w:r>
+        <w:rPr>
+          <w:rFonts w:ascii="Segoe UI" w:hAnsi="Segoe UI"/>
+          <w:b/>
+          <w:i w:val="0"/>
+          <w:color w:val="FF7A00"/>
+          <w:sz w:val="17"/>
+        </w:rPr>
+        <w:t xml:space="preserve">–  </w:t>
+      </w:r>
+      <w:r>
+        <w:rPr>
+          <w:rFonts w:ascii="Segoe UI" w:hAnsi="Segoe UI"/>
+          <w:b w:val="0"/>
+          <w:i w:val="0"/>
+          <w:color w:val="1B2630"/>
+          <w:sz w:val="17"/>
+        </w:rPr>
+        <w:t>Zonder datum: technologie UZ Antwerpen (de podoloog is pas in januari terug) en SEBIA 1–2 voor Brugge (geen woensdag; de verantwoordelijke verpleegkundige is in januari afwezig). Nieuwe inhaalslots voor de droogloop van Kortrijk, Brugge en Antwerpen. Antwerpen vraagt alle SEBIA-sessies in het UZA of online.</w:t>
       </w:r>
     </w:p>
     <w:p>
@@ -7937,7 +7868,7 @@
           <w:color w:val="1B2630"/>
           <w:sz w:val="17"/>
         </w:rPr>
-        <w:t>SEBIA volgt de agenda van Dobbels: SEBIA 3–4 op de data die ze op 6 oktober aanbood, SEBIA 5 tussen 20 en 30 april; de dagen nog bij haar te bevestigen. Locaties: voorstel Leuven voor groep Oost, Kortrijk of Brugge, en UZ Gent.</w:t>
+        <w:t>SEBIA volgt de agenda van Dobbels: SEBIA 3–4 op de data die ze op 6 oktober aanbood, SEBIA 5 tussen 20 en 30 april; de dagen nog bij haar te bevestigen. Locaties: voorstel Leuven voor groep Oost, Kortrijk, en UZ Gent.</w:t>
       </w:r>
     </w:p>
     <w:p>
@@ -7963,7 +7894,7 @@
           <w:color w:val="1B2630"/>
           <w:sz w:val="17"/>
         </w:rPr>
-        <w:t>Inhaal SEBIA: voor SEBIA 1–2 is er geen; dat van SEBIA 3–4 (ma 8 mrt) past op maandag alleen voor Kortrijk en mogelijk Brugge. Zie planning, Te beslissen.</w:t>
+        <w:t>Inhaal SEBIA: voor SEBIA 1–2 is er geen; dat van SEBIA 3–4 (ma 8 mrt) past op maandag voor Kortrijk en Brugge. Zie planning, Te beslissen.</w:t>
       </w:r>
     </w:p>
     <w:sectPr>

</xml_diff>

<commit_message>
Opleiding stand 27/10: fiche Aalst (alles ja), aparte SEBIA 1-2 voor UZA voorgesteld (di 5 of wo 6 jan, wacht op Dobbels), groep Oost = Leuven en Aalst, EC-indiening 26/10
Co-Authored-By: Claude Opus 5.5 <noreply@anthropic.com>
</commit_message>
<xml_diff>
--- a/Educatie/PARADISE_kalender_opleiding.docx
+++ b/Educatie/PARADISE_kalender_opleiding.docx
@@ -37,7 +37,7 @@
           <w:color w:val="5A6A78"/>
           <w:sz w:val="17"/>
         </w:rPr>
-        <w:t>November 2026 tot april 2027, volgens de opleidingsplanning van 25 oktober 2026, met de teruggestuurde fiches. VM = voormiddag, NM = namiddag. Waar een centrum nog moet kiezen (Gent, SEBIA 1–2), staat optie A in het rooster en optie B onder de maand. Artsen volgen alleen theorie en kunnen aansluiten bij het theoriedeel van de technologie; de praktijk en de droogloop zijn voor de podologen.</w:t>
+        <w:t>November 2026 tot april 2027, volgens de opleidingsplanning van 27 oktober 2026, met de teruggestuurde fiches. VM = voormiddag, NM = namiddag. Waar een centrum nog moet kiezen (Gent, SEBIA 1–2), staat optie A in het rooster en optie B onder de maand. Artsen volgen alleen theorie en kunnen aansluiten bij het theoriedeel van de technologie; de praktijk en de droogloop zijn voor de podologen.</w:t>
       </w:r>
     </w:p>
     <w:tbl>
@@ -2308,7 +2308,7 @@
         <w:tc>
           <w:tcPr>
             <w:tcW w:w="2835" w:type="dxa"/>
-            <w:shd w:val="clear" w:color="auto" w:fill="FFFFFF"/>
+            <w:shd w:val="clear" w:color="auto" w:fill="FFE9D6"/>
           </w:tcPr>
           <w:p>
             <w:pPr>
@@ -2321,6 +2321,26 @@
                 <w:sz w:val="15"/>
               </w:rPr>
               <w:t>5</w:t>
+            </w:r>
+          </w:p>
+          <w:p>
+            <w:pPr>
+              <w:spacing w:before="20" w:after="20"/>
+            </w:pPr>
+            <w:r>
+              <w:rPr>
+                <w:b/>
+                <w:color w:val="A34A00"/>
+                <w:sz w:val="15"/>
+              </w:rPr>
+              <w:t>SEBIA 1–2, Antwerpen</w:t>
+            </w:r>
+            <w:r>
+              <w:rPr>
+                <w:color w:val="1B2630"/>
+                <w:sz w:val="15"/>
+              </w:rPr>
+              <w:t xml:space="preserve"> · UZ Antwerpen · voorstel, of wo 6</w:t>
             </w:r>
           </w:p>
         </w:tc>
@@ -2488,7 +2508,7 @@
                 <w:color w:val="A34A00"/>
                 <w:sz w:val="15"/>
               </w:rPr>
-              <w:t>13u–17u  SEBIA 1–2, groep Oost</w:t>
+              <w:t>13u–17u  SEBIA 1–2, groep Oost (Leuven, Aalst)</w:t>
             </w:r>
             <w:r>
               <w:rPr>
@@ -3101,7 +3121,7 @@
           <w:color w:val="1B2630"/>
           <w:sz w:val="16"/>
         </w:rPr>
-        <w:t>SEBIA 1–2 voor Kortrijk op wo 16 dec en droogloop Brugge op ma 18 jan VM (optie B, gekozen). Voorstellen, te bevestigen: SEBIA 1–2 voor Brugge op ma 14 dec 9u–13u in AZ Sint-Jan; droogloop Kortrijk op wo 13 jan (wo 20 jan past niet), met ma 25 jan VM als inhaal; inhaal Brugge ma 25 jan NM; technologie UZ Antwerpen wo 20 jan VM; inhaal Antwerpen di 2 feb VM. Gent kiest nog voor SEBIA 1–2: vr 15 jan, of vr 11 dec 13u–17u.</w:t>
+        <w:t>SEBIA 1–2 voor Kortrijk op wo 16 dec en droogloop Brugge op ma 18 jan VM (optie B, gekozen). Voorstellen, te bevestigen: SEBIA 1–2 voor Brugge op ma 14 dec 9u–13u in AZ Sint-Jan; droogloop Kortrijk op wo 13 jan (wo 20 jan past niet), met ma 25 jan VM als inhaal; inhaal Brugge ma 25 jan NM; technologie UZ Antwerpen wo 20 jan VM; inhaal Antwerpen di 2 feb VM. SEBIA 1–2 voor Antwerpen: voorstel di 5 of wo 6 jan, VM of NM, in het UZA, alleen voor hun team; eerst het akkoord van Dobbels, dan te bevestigen door het UZA. Gent kiest nog voor SEBIA 1–2: vr 15 jan, of vr 11 dec 13u–17u.</w:t>
       </w:r>
     </w:p>
     <w:p>
@@ -5597,7 +5617,7 @@
           <w:color w:val="1B2630"/>
           <w:sz w:val="17"/>
         </w:rPr>
-        <w:t xml:space="preserve">1,5 u per podoloog in het eigen centrum, door Dobbels, tussen 20 en 30 april; de dag per centrum is een voorstel. SEBIA 3–4 heeft één inhaalmoment, ma 8 maart. </w:t>
+        <w:t xml:space="preserve">1,5 u per podoloog in het eigen centrum, door Dobbels, tussen 20 en 30 april; de dag per centrum is bevestigd door Kortrijk, Brugge, Aalst en Leuven, nog niet door Gent, Antwerpen en Dobbels. SEBIA 3–4 heeft één inhaalmoment, ma 8 maart. </w:t>
       </w:r>
       <w:r>
         <w:rPr>
@@ -5652,7 +5672,7 @@
           <w:color w:val="5A6A78"/>
           <w:sz w:val="17"/>
         </w:rPr>
-        <w:t>Technologie en droogloop ter plaatse; SEBIA 1–2 in vier groepen, voor Gent en Brugge in het eigen centrum; SEBIA 3–4 in drie groepen; SEBIA 5 in het eigen centrum. De online sessies staan in de maandrasters. De technologie begint met theorie, waar de artsen kunnen aansluiten en de drie pedorthisten elk één keer komen, bij een van hun centra.</w:t>
+        <w:t>Technologie en droogloop ter plaatse; SEBIA 1–2 in vijf groepen, voor Gent, Brugge en Antwerpen in het eigen centrum; SEBIA 3–4 in drie groepen; SEBIA 5 in het eigen centrum. De online sessies staan in de maandrasters. De technologie begint met theorie, waar de artsen kunnen aansluiten en de drie pedorthisten elk één keer komen, bij een van hun centra.</w:t>
       </w:r>
     </w:p>
     <w:tbl>
@@ -6595,7 +6615,7 @@
                 <w:color w:val="1B2630"/>
                 <w:sz w:val="16"/>
               </w:rPr>
-              <w:t>Oost: di 12 jan, 13u–17u</w:t>
+              <w:t>di 5 of wo 6 jan, in het UZA · voorstel</w:t>
             </w:r>
           </w:p>
         </w:tc>
@@ -6722,7 +6742,7 @@
           <w:color w:val="1B2630"/>
           <w:sz w:val="17"/>
         </w:rPr>
-        <w:t>Fiches terug van Kortrijk, Brugge en Leuven; Antwerpen vulde alleen de technologie in, Gent bevestigt di 27 okt en Aalst na een intern overleg op ma 2 nov.</w:t>
+        <w:t>Fiches terug van Kortrijk, Brugge, Leuven en Aalst; Antwerpen vulde alleen de technologie in, Gent zou di 27 okt bevestigen.</w:t>
       </w:r>
     </w:p>
     <w:p>
@@ -6743,7 +6763,7 @@
           <w:color w:val="1B2630"/>
           <w:sz w:val="17"/>
         </w:rPr>
-        <w:t>Voorstellen, te bevestigen door de centra en Dobbels: SEBIA 1–2 Brugge ma 14 dec; technologie Antwerpen wo 20 jan; droogloop Kortrijk wo 13 jan; inhaal Kortrijk ma 25 jan VM, Brugge ma 25 jan NM, Antwerpen di 2 feb VM; SEBIA 3–4 voor groep Oost in het UZA, op vraag van Antwerpen.</w:t>
+        <w:t>Voorstellen, te bevestigen door de centra en Dobbels: SEBIA 1–2 Brugge ma 14 dec; technologie Antwerpen wo 20 jan; droogloop Kortrijk wo 13 jan; inhaal Kortrijk ma 25 jan VM, Brugge ma 25 jan NM, Antwerpen di 2 feb VM; SEBIA 1–2 voor Antwerpen apart in het UZA op di 5 of wo 6 jan, en SEBIA 3–4 voor groep Oost in het UZA, op vraag van Antwerpen (eerst het akkoord van Dobbels).</w:t>
       </w:r>
     </w:p>
     <w:p>
@@ -6827,7 +6847,7 @@
           <w:color w:val="1B2630"/>
           <w:sz w:val="17"/>
         </w:rPr>
-        <w:t>SEBIA volgt de agenda van Dobbels: SEBIA 3–4 op de data die ze op 6 oktober aanbood, SEBIA 5 tussen 20 en 30 april; de dagen nog bij haar te bevestigen. Locaties (voorstel): groep Oost eerst in Leuven, dan in het UZA; Kortrijk; AZ Sint-Jan; UZ Gent.</w:t>
+        <w:t>SEBIA volgt de agenda van Dobbels: SEBIA 3–4 op de data die ze op 6 oktober aanbood, SEBIA 5 tussen 20 en 30 april; de dagen nog bij haar te bevestigen. Locaties (voorstel): groep Oost (Leuven, Aalst) eerst in Leuven, dan met Antwerpen in het UZA; Antwerpen voor SEBIA 1–2 apart in het UZA; Kortrijk; AZ Sint-Jan; UZ Gent.</w:t>
       </w:r>
     </w:p>
     <w:p>

</xml_diff>